<commit_message>
added documentation for background_substraction
</commit_message>
<xml_diff>
--- a/FinalProject/Document/final_project_212047542_327703013.docx
+++ b/FinalProject/Document/final_project_212047542_327703013.docx
@@ -136,15 +136,7 @@
           <w:szCs w:val="24"/>
           <w:u w:val="single"/>
         </w:rPr>
-        <w:t xml:space="preserve"> Pipeline Architecture</w:t>
-      </w:r>
-      <w:r>
-        <w:rPr>
-          <w:sz w:val="24"/>
-          <w:szCs w:val="24"/>
-          <w:u w:val="single"/>
-        </w:rPr>
-        <w:t>:</w:t>
+        <w:t xml:space="preserve"> Pipeline Architecture:</w:t>
       </w:r>
     </w:p>
     <w:p>
@@ -384,7 +376,23 @@
           <w:sz w:val="24"/>
           <w:szCs w:val="24"/>
         </w:rPr>
-        <w:t>. Because the thresholded corner response consists of multi-pixel binary blobs rather than individual coordinates, we use connected component analysis to automatically compute each blob's center of mass (</w:t>
+        <w:t xml:space="preserve">. Because the </w:t>
+      </w:r>
+      <w:proofErr w:type="spellStart"/>
+      <w:r>
+        <w:rPr>
+          <w:sz w:val="24"/>
+          <w:szCs w:val="24"/>
+        </w:rPr>
+        <w:t>thresholded</w:t>
+      </w:r>
+      <w:proofErr w:type="spellEnd"/>
+      <w:r>
+        <w:rPr>
+          <w:sz w:val="24"/>
+          <w:szCs w:val="24"/>
+        </w:rPr>
+        <w:t xml:space="preserve"> corner response consists of multi-pixel binary blobs rather than individual coordinates, we use connected component analysis to automatically compute each blob's center of mass (</w:t>
       </w:r>
       <w:r>
         <w:rPr>
@@ -717,15 +725,7 @@
           <w:szCs w:val="24"/>
           <w:lang w:val="en-US"/>
         </w:rPr>
-        <w:t>)</w:t>
-      </w:r>
-      <w:r>
-        <w:rPr>
-          <w:sz w:val="24"/>
-          <w:szCs w:val="24"/>
-          <w:lang w:val="en-US"/>
-        </w:rPr>
-        <w:t xml:space="preserve"> </w:t>
+        <w:t xml:space="preserve">) </w:t>
       </w:r>
       <w:r>
         <w:rPr>
@@ -1662,8 +1662,20 @@
           <w:szCs w:val="24"/>
           <w:lang w:val="en-US"/>
         </w:rPr>
-        <w:t>Full Affine vs. Partial Affine vs. Homography</w:t>
-      </w:r>
+        <w:t xml:space="preserve">Full Affine vs. Partial Affine vs. </w:t>
+      </w:r>
+      <w:proofErr w:type="spellStart"/>
+      <w:r>
+        <w:rPr>
+          <w:b/>
+          <w:bCs/>
+          <w:sz w:val="24"/>
+          <w:szCs w:val="24"/>
+          <w:lang w:val="en-US"/>
+        </w:rPr>
+        <w:t>Homography</w:t>
+      </w:r>
+      <w:proofErr w:type="spellEnd"/>
       <w:r>
         <w:rPr>
           <w:b/>
@@ -1829,15 +1841,27 @@
           <w:lang w:val="en-US"/>
         </w:rPr>
       </w:pPr>
-      <w:r>
-        <w:rPr>
-          <w:b/>
-          <w:bCs/>
-          <w:sz w:val="24"/>
-          <w:szCs w:val="24"/>
-          <w:lang w:val="en-US"/>
-        </w:rPr>
-        <w:t>Homography (8 DOF / Projective):</w:t>
+      <w:proofErr w:type="spellStart"/>
+      <w:r>
+        <w:rPr>
+          <w:b/>
+          <w:bCs/>
+          <w:sz w:val="24"/>
+          <w:szCs w:val="24"/>
+          <w:lang w:val="en-US"/>
+        </w:rPr>
+        <w:t>Homography</w:t>
+      </w:r>
+      <w:proofErr w:type="spellEnd"/>
+      <w:r>
+        <w:rPr>
+          <w:b/>
+          <w:bCs/>
+          <w:sz w:val="24"/>
+          <w:szCs w:val="24"/>
+          <w:lang w:val="en-US"/>
+        </w:rPr>
+        <w:t xml:space="preserve"> (8 DOF / Projective):</w:t>
       </w:r>
       <w:r>
         <w:rPr>
@@ -1939,7 +1963,25 @@
           <w:szCs w:val="24"/>
           <w:lang w:val="en-US"/>
         </w:rPr>
-        <w:t>tilting, upgrading to a Homography model did not yield a visible change. The simpler Partial Affine model, with</w:t>
+        <w:t xml:space="preserve">tilting, upgrading to a </w:t>
+      </w:r>
+      <w:proofErr w:type="spellStart"/>
+      <w:r>
+        <w:rPr>
+          <w:sz w:val="24"/>
+          <w:szCs w:val="24"/>
+          <w:lang w:val="en-US"/>
+        </w:rPr>
+        <w:t>Homography</w:t>
+      </w:r>
+      <w:proofErr w:type="spellEnd"/>
+      <w:r>
+        <w:rPr>
+          <w:sz w:val="24"/>
+          <w:szCs w:val="24"/>
+          <w:lang w:val="en-US"/>
+        </w:rPr>
+        <w:t xml:space="preserve"> model did not yield a visible change. The simpler Partial Affine model, with</w:t>
       </w:r>
       <w:r>
         <w:rPr>
@@ -2003,6 +2045,1345 @@
           <w:sz w:val="24"/>
           <w:szCs w:val="24"/>
           <w:lang w:val="en-US"/>
+        </w:rPr>
+      </w:pPr>
+    </w:p>
+    <w:p>
+      <w:r>
+        <w:br w:type="page"/>
+      </w:r>
+    </w:p>
+    <w:p>
+      <w:pPr>
+        <w:spacing w:after="120" w:line="259" w:lineRule="auto"/>
+        <w:rPr>
+          <w:bCs/>
+          <w:sz w:val="28"/>
+          <w:szCs w:val="28"/>
+        </w:rPr>
+      </w:pPr>
+      <w:r>
+        <w:rPr>
+          <w:b/>
+          <w:sz w:val="28"/>
+          <w:szCs w:val="28"/>
+        </w:rPr>
+        <w:lastRenderedPageBreak/>
+        <w:t>Stage 2: Background Subtraction</w:t>
+      </w:r>
+    </w:p>
+    <w:p>
+      <w:pPr>
+        <w:spacing w:after="120" w:line="259" w:lineRule="auto"/>
+        <w:rPr>
+          <w:bCs/>
+          <w:sz w:val="24"/>
+          <w:szCs w:val="24"/>
+          <w:u w:val="single"/>
+        </w:rPr>
+      </w:pPr>
+      <w:r>
+        <w:rPr>
+          <w:bCs/>
+          <w:sz w:val="24"/>
+          <w:szCs w:val="24"/>
+          <w:u w:val="single"/>
+        </w:rPr>
+        <w:t>Mathematical Formulation and Pipeline Architecture:</w:t>
+      </w:r>
+    </w:p>
+    <w:p>
+      <w:pPr>
+        <w:spacing w:after="120"/>
+        <w:rPr>
+          <w:sz w:val="24"/>
+          <w:szCs w:val="24"/>
+        </w:rPr>
+      </w:pPr>
+      <w:r>
+        <w:rPr>
+          <w:sz w:val="24"/>
+          <w:szCs w:val="24"/>
+        </w:rPr>
+        <w:t>The second stage receives the stabilized video from Stage 1 and separates the walking person from the static scene. In the course lectures, background subtraction was introduced as a per-pixel temporal decision problem: for each pixel location (x, y), we observe its intensity profile across time and decide whether the current observation belongs to the static background or to a dynamic foreground object. The simplest approach would be frame differencing, but that is too sensitive to noise and residual stabilization motion. Therefore, we used a Gaussian Mixture Model background model, implemented through OpenCV MOG2, and then added our own temporal consistency, component selection, and forward/backward mask fusion around it.</w:t>
+      </w:r>
+    </w:p>
+    <w:p>
+      <w:pPr>
+        <w:spacing w:after="120"/>
+        <w:rPr>
+          <w:sz w:val="24"/>
+          <w:szCs w:val="24"/>
+        </w:rPr>
+      </w:pPr>
+      <w:r>
+        <w:rPr>
+          <w:sz w:val="24"/>
+          <w:szCs w:val="24"/>
+        </w:rPr>
+        <w:t xml:space="preserve">For every pixel value </w:t>
+      </w:r>
+      <m:oMath>
+        <m:sSub>
+          <m:sSubPr>
+            <m:ctrlPr>
+              <w:rPr>
+                <w:rFonts w:ascii="Cambria Math" w:hAnsi="Cambria Math"/>
+                <w:i/>
+                <w:sz w:val="24"/>
+                <w:szCs w:val="24"/>
+              </w:rPr>
+            </m:ctrlPr>
+          </m:sSubPr>
+          <m:e>
+            <m:r>
+              <w:rPr>
+                <w:rFonts w:ascii="Cambria Math" w:hAnsi="Cambria Math"/>
+                <w:sz w:val="24"/>
+                <w:szCs w:val="24"/>
+              </w:rPr>
+              <m:t>x</m:t>
+            </m:r>
+          </m:e>
+          <m:sub>
+            <m:r>
+              <w:rPr>
+                <w:rFonts w:ascii="Cambria Math" w:hAnsi="Cambria Math"/>
+                <w:sz w:val="24"/>
+                <w:szCs w:val="24"/>
+              </w:rPr>
+              <m:t>t</m:t>
+            </m:r>
+          </m:sub>
+        </m:sSub>
+      </m:oMath>
+      <w:r>
+        <w:rPr>
+          <w:sz w:val="24"/>
+          <w:szCs w:val="24"/>
+        </w:rPr>
+        <w:t xml:space="preserve"> at time t, the background model is represented as a mixture of K Gaussian distributions. In our implementation </w:t>
+      </w:r>
+      <m:oMath>
+        <m:sSub>
+          <m:sSubPr>
+            <m:ctrlPr>
+              <w:rPr>
+                <w:rFonts w:ascii="Cambria Math" w:hAnsi="Cambria Math"/>
+                <w:i/>
+                <w:sz w:val="24"/>
+                <w:szCs w:val="24"/>
+              </w:rPr>
+            </m:ctrlPr>
+          </m:sSubPr>
+          <m:e>
+            <m:r>
+              <w:rPr>
+                <w:rFonts w:ascii="Cambria Math" w:hAnsi="Cambria Math"/>
+                <w:sz w:val="24"/>
+                <w:szCs w:val="24"/>
+              </w:rPr>
+              <m:t>x</m:t>
+            </m:r>
+          </m:e>
+          <m:sub>
+            <m:r>
+              <w:rPr>
+                <w:rFonts w:ascii="Cambria Math" w:hAnsi="Cambria Math"/>
+                <w:sz w:val="24"/>
+                <w:szCs w:val="24"/>
+              </w:rPr>
+              <m:t>t</m:t>
+            </m:r>
+          </m:sub>
+        </m:sSub>
+      </m:oMath>
+      <w:r>
+        <w:rPr>
+          <w:sz w:val="24"/>
+          <w:szCs w:val="24"/>
+        </w:rPr>
+        <w:t xml:space="preserve"> is not a raw BGR pixel</w:t>
+      </w:r>
+      <w:r>
+        <w:rPr>
+          <w:sz w:val="24"/>
+          <w:szCs w:val="24"/>
+        </w:rPr>
+        <w:t>:</w:t>
+      </w:r>
+      <w:r>
+        <w:rPr>
+          <w:sz w:val="24"/>
+          <w:szCs w:val="24"/>
+        </w:rPr>
+        <w:t xml:space="preserve"> before modeling, each frame is converted to HSV and blurred slightly, so that the model is less sensitive to small illumination noise and small stabilization jitter.</w:t>
+      </w:r>
+    </w:p>
+    <w:p>
+      <w:pPr>
+        <w:spacing w:after="120" w:line="259" w:lineRule="auto"/>
+        <w:rPr>
+          <w:sz w:val="24"/>
+          <w:szCs w:val="24"/>
+        </w:rPr>
+      </w:pPr>
+      <w:r>
+        <w:rPr>
+          <w:sz w:val="24"/>
+          <w:szCs w:val="24"/>
+        </w:rPr>
+        <w:t>The implemented pipeline is organized as follows:</w:t>
+      </w:r>
+    </w:p>
+    <w:p>
+      <w:pPr>
+        <w:pStyle w:val="a8"/>
+        <w:numPr>
+          <w:ilvl w:val="0"/>
+          <w:numId w:val="13"/>
+        </w:numPr>
+        <w:spacing w:after="120"/>
+        <w:rPr>
+          <w:sz w:val="24"/>
+          <w:szCs w:val="24"/>
+        </w:rPr>
+      </w:pPr>
+      <w:r>
+        <w:rPr>
+          <w:b/>
+          <w:bCs/>
+          <w:sz w:val="24"/>
+          <w:szCs w:val="24"/>
+        </w:rPr>
+        <w:t>Storing the Input from Stage 1:</w:t>
+      </w:r>
+      <w:r>
+        <w:rPr>
+          <w:sz w:val="24"/>
+          <w:szCs w:val="24"/>
+        </w:rPr>
+        <w:t xml:space="preserve"> the stabilized video is read into memory. Since our method compares two temporal directions, the full frame list is needed.</w:t>
+      </w:r>
+    </w:p>
+    <w:p>
+      <w:pPr>
+        <w:pStyle w:val="a8"/>
+        <w:numPr>
+          <w:ilvl w:val="0"/>
+          <w:numId w:val="13"/>
+        </w:numPr>
+        <w:spacing w:after="120"/>
+        <w:rPr>
+          <w:sz w:val="24"/>
+          <w:szCs w:val="24"/>
+        </w:rPr>
+      </w:pPr>
+      <w:r>
+        <w:rPr>
+          <w:b/>
+          <w:bCs/>
+          <w:sz w:val="24"/>
+          <w:szCs w:val="24"/>
+        </w:rPr>
+        <w:t>Forward modeling:</w:t>
+      </w:r>
+      <w:r>
+        <w:rPr>
+          <w:sz w:val="24"/>
+          <w:szCs w:val="24"/>
+        </w:rPr>
+        <w:t xml:space="preserve"> MOG2 is trained on the frames in chronological order. Each frame</w:t>
+      </w:r>
+      <w:r>
+        <w:rPr>
+          <w:sz w:val="24"/>
+          <w:szCs w:val="24"/>
+        </w:rPr>
+        <w:t xml:space="preserve"> </w:t>
+      </w:r>
+      <w:r>
+        <w:rPr>
+          <w:sz w:val="24"/>
+          <w:szCs w:val="24"/>
+        </w:rPr>
+        <w:t>is converted to HSV, blurred with a small Gaussian kernel, and passed to the model with a small learning rate.</w:t>
+      </w:r>
+    </w:p>
+    <w:p>
+      <w:pPr>
+        <w:pStyle w:val="a8"/>
+        <w:numPr>
+          <w:ilvl w:val="0"/>
+          <w:numId w:val="13"/>
+        </w:numPr>
+        <w:spacing w:after="120"/>
+        <w:rPr>
+          <w:sz w:val="24"/>
+          <w:szCs w:val="24"/>
+        </w:rPr>
+      </w:pPr>
+      <w:r>
+        <w:rPr>
+          <w:b/>
+          <w:bCs/>
+          <w:sz w:val="24"/>
+          <w:szCs w:val="24"/>
+        </w:rPr>
+        <w:t>Forward extraction:</w:t>
+      </w:r>
+      <w:r>
+        <w:rPr>
+          <w:sz w:val="24"/>
+          <w:szCs w:val="24"/>
+        </w:rPr>
+        <w:t xml:space="preserve"> the trained model is frozen using </w:t>
+      </w:r>
+      <w:proofErr w:type="spellStart"/>
+      <w:r>
+        <w:rPr>
+          <w:sz w:val="24"/>
+          <w:szCs w:val="24"/>
+        </w:rPr>
+        <w:t>learningRate</w:t>
+      </w:r>
+      <w:proofErr w:type="spellEnd"/>
+      <w:r>
+        <w:rPr>
+          <w:sz w:val="24"/>
+          <w:szCs w:val="24"/>
+        </w:rPr>
+        <w:t xml:space="preserve"> = 0.0. Each frame is classified into background, shadow, or foreground. Only true foreground pixels with value 255 are retained.</w:t>
+      </w:r>
+    </w:p>
+    <w:p>
+      <w:pPr>
+        <w:pStyle w:val="a8"/>
+        <w:numPr>
+          <w:ilvl w:val="0"/>
+          <w:numId w:val="13"/>
+        </w:numPr>
+        <w:spacing w:after="120"/>
+        <w:rPr>
+          <w:sz w:val="24"/>
+          <w:szCs w:val="24"/>
+        </w:rPr>
+      </w:pPr>
+      <w:r>
+        <w:rPr>
+          <w:b/>
+          <w:bCs/>
+          <w:sz w:val="24"/>
+          <w:szCs w:val="24"/>
+        </w:rPr>
+        <w:t>Backward modeling and extraction:</w:t>
+      </w:r>
+      <w:r>
+        <w:rPr>
+          <w:sz w:val="24"/>
+          <w:szCs w:val="24"/>
+        </w:rPr>
+        <w:t xml:space="preserve"> the exact same process is repeated on the reversed frame order. After extraction, the resulting masks are reversed back to the original order.</w:t>
+      </w:r>
+    </w:p>
+    <w:p>
+      <w:pPr>
+        <w:pStyle w:val="a8"/>
+        <w:numPr>
+          <w:ilvl w:val="0"/>
+          <w:numId w:val="13"/>
+        </w:numPr>
+        <w:spacing w:after="120"/>
+        <w:rPr>
+          <w:b/>
+          <w:bCs/>
+          <w:sz w:val="24"/>
+          <w:szCs w:val="24"/>
+        </w:rPr>
+      </w:pPr>
+      <w:r>
+        <w:rPr>
+          <w:b/>
+          <w:bCs/>
+          <w:sz w:val="24"/>
+          <w:szCs w:val="24"/>
+        </w:rPr>
+        <w:t>Morphological cleanup:</w:t>
+      </w:r>
+      <w:r>
+        <w:rPr>
+          <w:sz w:val="24"/>
+          <w:szCs w:val="24"/>
+        </w:rPr>
+        <w:t xml:space="preserve"> opening removes isolated noise, closing reconnects fragmented body regions, and contour-based hole filling removes black gaps inside the silhouette.</w:t>
+      </w:r>
+    </w:p>
+    <w:p>
+      <w:pPr>
+        <w:pStyle w:val="a8"/>
+        <w:numPr>
+          <w:ilvl w:val="0"/>
+          <w:numId w:val="13"/>
+        </w:numPr>
+        <w:spacing w:after="120"/>
+        <w:rPr>
+          <w:sz w:val="24"/>
+          <w:szCs w:val="24"/>
+        </w:rPr>
+      </w:pPr>
+      <w:r>
+        <w:rPr>
+          <w:b/>
+          <w:bCs/>
+          <w:sz w:val="24"/>
+          <w:szCs w:val="24"/>
+        </w:rPr>
+        <w:lastRenderedPageBreak/>
+        <w:t>Person component selection:</w:t>
+      </w:r>
+      <w:r>
+        <w:rPr>
+          <w:sz w:val="24"/>
+          <w:szCs w:val="24"/>
+        </w:rPr>
+        <w:t xml:space="preserve"> connected components are extracted and scored according to area, height, distance from the previous center, and bounding-box consistency.</w:t>
+      </w:r>
+    </w:p>
+    <w:p>
+      <w:pPr>
+        <w:pStyle w:val="a8"/>
+        <w:numPr>
+          <w:ilvl w:val="0"/>
+          <w:numId w:val="13"/>
+        </w:numPr>
+        <w:spacing w:after="120"/>
+        <w:rPr>
+          <w:sz w:val="24"/>
+          <w:szCs w:val="24"/>
+        </w:rPr>
+      </w:pPr>
+      <w:r>
+        <w:rPr>
+          <w:b/>
+          <w:bCs/>
+          <w:sz w:val="24"/>
+          <w:szCs w:val="24"/>
+        </w:rPr>
+        <w:t>Forward/backward fusion:</w:t>
+      </w:r>
+      <w:r>
+        <w:rPr>
+          <w:sz w:val="24"/>
+          <w:szCs w:val="24"/>
+        </w:rPr>
+        <w:t xml:space="preserve"> the two masks are combined. If they overlap, the overlap is treated as reliable support. If they do not overlap, the smaller mask is used to reduce background leakage.</w:t>
+      </w:r>
+    </w:p>
+    <w:p>
+      <w:pPr>
+        <w:spacing w:after="120" w:line="259" w:lineRule="auto"/>
+        <w:rPr>
+          <w:bCs/>
+          <w:sz w:val="24"/>
+          <w:szCs w:val="24"/>
+          <w:u w:val="single"/>
+        </w:rPr>
+      </w:pPr>
+      <w:r>
+        <w:rPr>
+          <w:bCs/>
+          <w:sz w:val="24"/>
+          <w:szCs w:val="24"/>
+          <w:u w:val="single"/>
+        </w:rPr>
+        <w:t>Systematic Troubleshooting and Optimization Path:</w:t>
+      </w:r>
+    </w:p>
+    <w:p>
+      <w:pPr>
+        <w:spacing w:after="120"/>
+        <w:rPr>
+          <w:sz w:val="24"/>
+          <w:szCs w:val="24"/>
+        </w:rPr>
+      </w:pPr>
+      <w:r>
+        <w:rPr>
+          <w:sz w:val="24"/>
+          <w:szCs w:val="24"/>
+        </w:rPr>
+        <w:t>We started with a direct MOG2 background subtractor. This produced ghosting and background leakage, especially near high-contrast posters and at the end of the sequence. The reason is that background subtraction is extremely sensitive to residual stabilization motion: a wall that moves by only a few pixels may be classified as foreground. In addition, if the person appears over the same background location for many frames, the background model can partially absorb the person or leave a ghost when the person moves away.</w:t>
+      </w:r>
+    </w:p>
+    <w:p>
+      <w:pPr>
+        <w:spacing w:after="120"/>
+        <w:rPr>
+          <w:sz w:val="24"/>
+          <w:szCs w:val="24"/>
+        </w:rPr>
+      </w:pPr>
+      <w:r>
+        <w:rPr>
+          <w:sz w:val="24"/>
+          <w:szCs w:val="24"/>
+        </w:rPr>
+        <w:t>The following optimizations were introduced during development:</w:t>
+      </w:r>
+    </w:p>
+    <w:p>
+      <w:pPr>
+        <w:pStyle w:val="a8"/>
+        <w:numPr>
+          <w:ilvl w:val="0"/>
+          <w:numId w:val="14"/>
+        </w:numPr>
+        <w:spacing w:after="120"/>
+        <w:rPr>
+          <w:sz w:val="24"/>
+          <w:szCs w:val="24"/>
+        </w:rPr>
+      </w:pPr>
+      <w:r>
+        <w:rPr>
+          <w:b/>
+          <w:bCs/>
+          <w:sz w:val="24"/>
+          <w:szCs w:val="24"/>
+        </w:rPr>
+        <w:t>HSV preprocessing:</w:t>
+      </w:r>
+      <w:r>
+        <w:rPr>
+          <w:sz w:val="24"/>
+          <w:szCs w:val="24"/>
+        </w:rPr>
+        <w:t xml:space="preserve"> Instead of applying MOG2 directly on BGR frames, frames are converted to HSV. HSV partially separates chromatic content from brightness and produced more stable masks under small illumination changes.</w:t>
+      </w:r>
+    </w:p>
+    <w:p>
+      <w:pPr>
+        <w:pStyle w:val="a8"/>
+        <w:numPr>
+          <w:ilvl w:val="0"/>
+          <w:numId w:val="14"/>
+        </w:numPr>
+        <w:spacing w:after="120"/>
+        <w:rPr>
+          <w:sz w:val="24"/>
+          <w:szCs w:val="24"/>
+        </w:rPr>
+      </w:pPr>
+      <w:r>
+        <w:rPr>
+          <w:b/>
+          <w:bCs/>
+          <w:sz w:val="24"/>
+          <w:szCs w:val="24"/>
+        </w:rPr>
+        <w:t>Gaussian blur before modeling:</w:t>
+      </w:r>
+      <w:r>
+        <w:rPr>
+          <w:sz w:val="24"/>
+          <w:szCs w:val="24"/>
+        </w:rPr>
+        <w:t xml:space="preserve"> </w:t>
+      </w:r>
+      <w:r>
+        <w:rPr>
+          <w:sz w:val="24"/>
+          <w:szCs w:val="24"/>
+        </w:rPr>
+        <w:t>A</w:t>
+      </w:r>
+      <w:r>
+        <w:rPr>
+          <w:sz w:val="24"/>
+          <w:szCs w:val="24"/>
+        </w:rPr>
+        <w:t xml:space="preserve"> </w:t>
+      </w:r>
+      <m:oMath>
+        <m:r>
+          <w:rPr>
+            <w:rFonts w:ascii="Cambria Math" w:hAnsi="Cambria Math"/>
+            <w:sz w:val="24"/>
+            <w:szCs w:val="24"/>
+          </w:rPr>
+          <m:t>5×5</m:t>
+        </m:r>
+      </m:oMath>
+      <w:r>
+        <w:rPr>
+          <w:sz w:val="24"/>
+          <w:szCs w:val="24"/>
+        </w:rPr>
+        <w:t xml:space="preserve"> blur suppresses single-pixel jitter and camera-stabilization noise before the model observes the frame.</w:t>
+      </w:r>
+    </w:p>
+    <w:p>
+      <w:pPr>
+        <w:pStyle w:val="a8"/>
+        <w:numPr>
+          <w:ilvl w:val="0"/>
+          <w:numId w:val="14"/>
+        </w:numPr>
+        <w:spacing w:after="120"/>
+        <w:rPr>
+          <w:sz w:val="24"/>
+          <w:szCs w:val="24"/>
+        </w:rPr>
+      </w:pPr>
+      <w:r>
+        <w:rPr>
+          <w:b/>
+          <w:bCs/>
+          <w:sz w:val="24"/>
+          <w:szCs w:val="24"/>
+        </w:rPr>
+        <w:t>Bidirectional processing:</w:t>
+      </w:r>
+      <w:r>
+        <w:rPr>
+          <w:sz w:val="24"/>
+          <w:szCs w:val="24"/>
+        </w:rPr>
+        <w:t xml:space="preserve"> A forward-only model is weaker at the end of the video, while a backward-only model is weaker at the beginning. Combining both directions reduces this temporal bias.</w:t>
+      </w:r>
+    </w:p>
+    <w:p>
+      <w:pPr>
+        <w:pStyle w:val="a8"/>
+        <w:numPr>
+          <w:ilvl w:val="0"/>
+          <w:numId w:val="14"/>
+        </w:numPr>
+        <w:spacing w:after="120"/>
+        <w:rPr>
+          <w:sz w:val="24"/>
+          <w:szCs w:val="24"/>
+        </w:rPr>
+      </w:pPr>
+      <w:r>
+        <w:rPr>
+          <w:b/>
+          <w:bCs/>
+          <w:sz w:val="24"/>
+          <w:szCs w:val="24"/>
+        </w:rPr>
+        <w:t>Shadow suppression:</w:t>
+      </w:r>
+      <w:r>
+        <w:rPr>
+          <w:sz w:val="24"/>
+          <w:szCs w:val="24"/>
+        </w:rPr>
+        <w:t xml:space="preserve"> MOG2 can output 127 for shadows. We discard it and keep only 255, because shadows created false foreground regions connected to the feet and floor.</w:t>
+      </w:r>
+    </w:p>
+    <w:p>
+      <w:pPr>
+        <w:pStyle w:val="a8"/>
+        <w:numPr>
+          <w:ilvl w:val="0"/>
+          <w:numId w:val="14"/>
+        </w:numPr>
+        <w:spacing w:after="120"/>
+        <w:rPr>
+          <w:sz w:val="24"/>
+          <w:szCs w:val="24"/>
+        </w:rPr>
+      </w:pPr>
+      <w:r>
+        <w:rPr>
+          <w:b/>
+          <w:bCs/>
+          <w:sz w:val="24"/>
+          <w:szCs w:val="24"/>
+        </w:rPr>
+        <w:t>Temporal component tracking:</w:t>
+      </w:r>
+      <w:r>
+        <w:rPr>
+          <w:sz w:val="24"/>
+          <w:szCs w:val="24"/>
+        </w:rPr>
+        <w:t xml:space="preserve"> Instead of selecting the largest component blindly, every connected component is scored using its similarity to the previous person position and size. This prevents the algorithm from jumping to a wall or poster artifact.</w:t>
+      </w:r>
+    </w:p>
+    <w:p>
+      <w:pPr>
+        <w:pStyle w:val="a8"/>
+        <w:numPr>
+          <w:ilvl w:val="0"/>
+          <w:numId w:val="14"/>
+        </w:numPr>
+        <w:spacing w:after="120"/>
+        <w:rPr>
+          <w:sz w:val="24"/>
+          <w:szCs w:val="24"/>
+        </w:rPr>
+      </w:pPr>
+      <w:r>
+        <w:rPr>
+          <w:b/>
+          <w:bCs/>
+          <w:sz w:val="24"/>
+          <w:szCs w:val="24"/>
+        </w:rPr>
+        <w:lastRenderedPageBreak/>
+        <w:t>Silhouette solidification:</w:t>
+      </w:r>
+      <w:r>
+        <w:rPr>
+          <w:sz w:val="24"/>
+          <w:szCs w:val="24"/>
+        </w:rPr>
+        <w:t xml:space="preserve"> Since background subtraction often creates holes inside dark clothing, the selected person component is closed and filled after it has already been selected.</w:t>
+      </w:r>
+    </w:p>
+    <w:p>
+      <w:pPr>
+        <w:spacing w:after="120"/>
+        <w:rPr>
+          <w:sz w:val="24"/>
+          <w:szCs w:val="24"/>
+        </w:rPr>
+      </w:pPr>
+      <w:r>
+        <w:rPr>
+          <w:sz w:val="24"/>
+          <w:szCs w:val="24"/>
+        </w:rPr>
+        <w:t xml:space="preserve">Rejected alternatives: KNN background subtraction and </w:t>
+      </w:r>
+      <w:proofErr w:type="spellStart"/>
+      <w:r>
+        <w:rPr>
+          <w:sz w:val="24"/>
+          <w:szCs w:val="24"/>
+        </w:rPr>
+        <w:t>GrabCut</w:t>
+      </w:r>
+      <w:proofErr w:type="spellEnd"/>
+      <w:r>
+        <w:rPr>
+          <w:sz w:val="24"/>
+          <w:szCs w:val="24"/>
+        </w:rPr>
+        <w:t xml:space="preserve"> refinement were tested. KNN did not improve the final quality, and </w:t>
+      </w:r>
+      <w:proofErr w:type="spellStart"/>
+      <w:r>
+        <w:rPr>
+          <w:sz w:val="24"/>
+          <w:szCs w:val="24"/>
+        </w:rPr>
+        <w:t>GrabCut</w:t>
+      </w:r>
+      <w:proofErr w:type="spellEnd"/>
+      <w:r>
+        <w:rPr>
+          <w:sz w:val="24"/>
+          <w:szCs w:val="24"/>
+        </w:rPr>
+        <w:t xml:space="preserve"> increased runtime significantly without solving the main leakage problem. We therefore kept MOG2 with our custom temporal logic.</w:t>
+      </w:r>
+    </w:p>
+    <w:p>
+      <w:pPr>
+        <w:spacing w:after="120" w:line="259" w:lineRule="auto"/>
+        <w:rPr>
+          <w:bCs/>
+          <w:sz w:val="24"/>
+          <w:szCs w:val="24"/>
+          <w:u w:val="single"/>
+        </w:rPr>
+      </w:pPr>
+      <w:r>
+        <w:rPr>
+          <w:sz w:val="24"/>
+          <w:szCs w:val="24"/>
+          <w:u w:val="single"/>
+          <w:lang w:val="en-US"/>
+        </w:rPr>
+        <w:t>Explanation of Advance Concepts</w:t>
+      </w:r>
+      <w:r>
+        <w:rPr>
+          <w:bCs/>
+          <w:sz w:val="24"/>
+          <w:szCs w:val="24"/>
+          <w:u w:val="single"/>
+        </w:rPr>
+        <w:t>:</w:t>
+      </w:r>
+    </w:p>
+    <w:p>
+      <w:pPr>
+        <w:pStyle w:val="a8"/>
+        <w:numPr>
+          <w:ilvl w:val="0"/>
+          <w:numId w:val="17"/>
+        </w:numPr>
+        <w:spacing w:after="120"/>
+        <w:rPr>
+          <w:sz w:val="24"/>
+          <w:szCs w:val="24"/>
+        </w:rPr>
+      </w:pPr>
+      <w:r>
+        <w:rPr>
+          <w:b/>
+          <w:i/>
+          <w:iCs/>
+          <w:sz w:val="24"/>
+          <w:szCs w:val="24"/>
+        </w:rPr>
+        <w:t>cv2.createBackgroundSubtractorMOG2:</w:t>
+      </w:r>
+      <w:r>
+        <w:rPr>
+          <w:b/>
+          <w:sz w:val="24"/>
+          <w:szCs w:val="24"/>
+        </w:rPr>
+        <w:t xml:space="preserve"> </w:t>
+      </w:r>
+      <w:r>
+        <w:rPr>
+          <w:sz w:val="24"/>
+          <w:szCs w:val="24"/>
+        </w:rPr>
+        <w:t>This function creates an online Gaussian Mixture Model background subtractor. Internally, each pixel maintains several Gaussian modes. A new observation is compared to the existing modes. If it is close enough to one mode, that mode is updated</w:t>
+      </w:r>
+      <w:r>
+        <w:rPr>
+          <w:sz w:val="24"/>
+          <w:szCs w:val="24"/>
+        </w:rPr>
+        <w:t>.</w:t>
+      </w:r>
+      <w:r>
+        <w:rPr>
+          <w:sz w:val="24"/>
+          <w:szCs w:val="24"/>
+        </w:rPr>
+        <w:t xml:space="preserve"> </w:t>
+      </w:r>
+      <w:r>
+        <w:rPr>
+          <w:sz w:val="24"/>
+          <w:szCs w:val="24"/>
+        </w:rPr>
+        <w:t>O</w:t>
+      </w:r>
+      <w:r>
+        <w:rPr>
+          <w:sz w:val="24"/>
+          <w:szCs w:val="24"/>
+        </w:rPr>
+        <w:t xml:space="preserve">therwise, a new mode is created or an old weak mode is replaced. The library function only produces a raw foreground mask. </w:t>
+      </w:r>
+    </w:p>
+    <w:p>
+      <w:pPr>
+        <w:pStyle w:val="a8"/>
+        <w:numPr>
+          <w:ilvl w:val="0"/>
+          <w:numId w:val="17"/>
+        </w:numPr>
+        <w:spacing w:after="120"/>
+        <w:rPr>
+          <w:sz w:val="24"/>
+          <w:szCs w:val="24"/>
+        </w:rPr>
+      </w:pPr>
+      <w:r>
+        <w:rPr>
+          <w:b/>
+          <w:sz w:val="24"/>
+          <w:szCs w:val="24"/>
+        </w:rPr>
+        <w:t>cv2.</w:t>
+      </w:r>
+      <w:r>
+        <w:rPr>
+          <w:b/>
+          <w:i/>
+          <w:iCs/>
+          <w:sz w:val="24"/>
+          <w:szCs w:val="24"/>
+        </w:rPr>
+        <w:t>morphologyEx</w:t>
+      </w:r>
+      <w:r>
+        <w:rPr>
+          <w:b/>
+          <w:i/>
+          <w:iCs/>
+          <w:sz w:val="24"/>
+          <w:szCs w:val="24"/>
+        </w:rPr>
+        <w:t>:</w:t>
+      </w:r>
+      <w:r>
+        <w:rPr>
+          <w:b/>
+          <w:sz w:val="24"/>
+          <w:szCs w:val="24"/>
+        </w:rPr>
+        <w:t xml:space="preserve"> </w:t>
+      </w:r>
+      <w:r>
+        <w:rPr>
+          <w:sz w:val="24"/>
+          <w:szCs w:val="24"/>
+        </w:rPr>
+        <w:t>Morphological operations modify the binary mask according to a small structuring element. Opening is erosion followed by dilation</w:t>
+      </w:r>
+      <w:r>
+        <w:rPr>
+          <w:sz w:val="24"/>
+          <w:szCs w:val="24"/>
+        </w:rPr>
+        <w:t>: for</w:t>
+      </w:r>
+      <w:r>
+        <w:rPr>
+          <w:sz w:val="24"/>
+          <w:szCs w:val="24"/>
+        </w:rPr>
+        <w:t xml:space="preserve"> remov</w:t>
+      </w:r>
+      <w:r>
+        <w:rPr>
+          <w:sz w:val="24"/>
+          <w:szCs w:val="24"/>
+        </w:rPr>
+        <w:t>ing</w:t>
+      </w:r>
+      <w:r>
+        <w:rPr>
+          <w:sz w:val="24"/>
+          <w:szCs w:val="24"/>
+        </w:rPr>
+        <w:t xml:space="preserve"> isolated white noise. Closing is dilation followed by erosion</w:t>
+      </w:r>
+      <w:r>
+        <w:rPr>
+          <w:sz w:val="24"/>
+          <w:szCs w:val="24"/>
+        </w:rPr>
+        <w:t>: for</w:t>
+      </w:r>
+      <w:r>
+        <w:rPr>
+          <w:sz w:val="24"/>
+          <w:szCs w:val="24"/>
+        </w:rPr>
+        <w:t xml:space="preserve"> reconnect</w:t>
+      </w:r>
+      <w:r>
+        <w:rPr>
+          <w:sz w:val="24"/>
+          <w:szCs w:val="24"/>
+        </w:rPr>
+        <w:t>ing</w:t>
+      </w:r>
+      <w:r>
+        <w:rPr>
+          <w:sz w:val="24"/>
+          <w:szCs w:val="24"/>
+        </w:rPr>
+        <w:t xml:space="preserve"> nearby white regions and fill</w:t>
+      </w:r>
+      <w:r>
+        <w:rPr>
+          <w:sz w:val="24"/>
+          <w:szCs w:val="24"/>
+        </w:rPr>
+        <w:t>ing</w:t>
+      </w:r>
+      <w:r>
+        <w:rPr>
+          <w:sz w:val="24"/>
+          <w:szCs w:val="24"/>
+        </w:rPr>
+        <w:t xml:space="preserve"> small gaps. We use elliptical kernels because the human body is not rectangular, and elliptical kernels expand the silhouette more naturally around arms, legs, and torso.</w:t>
+      </w:r>
+    </w:p>
+    <w:p>
+      <w:pPr>
+        <w:pStyle w:val="a8"/>
+        <w:numPr>
+          <w:ilvl w:val="0"/>
+          <w:numId w:val="17"/>
+        </w:numPr>
+        <w:spacing w:after="120"/>
+        <w:rPr>
+          <w:i/>
+          <w:iCs/>
+          <w:sz w:val="24"/>
+          <w:szCs w:val="24"/>
+        </w:rPr>
+      </w:pPr>
+      <w:r>
+        <w:rPr>
+          <w:b/>
+          <w:i/>
+          <w:iCs/>
+          <w:sz w:val="24"/>
+          <w:szCs w:val="24"/>
+        </w:rPr>
+        <w:t>cv2.findContours</w:t>
+      </w:r>
+      <w:r>
+        <w:rPr>
+          <w:b/>
+          <w:i/>
+          <w:iCs/>
+          <w:sz w:val="24"/>
+          <w:szCs w:val="24"/>
+        </w:rPr>
+        <w:t>:</w:t>
+      </w:r>
+      <w:r>
+        <w:rPr>
+          <w:b/>
+          <w:i/>
+          <w:iCs/>
+          <w:sz w:val="24"/>
+          <w:szCs w:val="24"/>
+        </w:rPr>
+        <w:t xml:space="preserve"> </w:t>
+      </w:r>
+      <w:r>
+        <w:rPr>
+          <w:sz w:val="24"/>
+          <w:szCs w:val="24"/>
+        </w:rPr>
+        <w:t xml:space="preserve">Contours describe the boundary curves of connected white regions in a binary image. </w:t>
+      </w:r>
+      <w:r>
+        <w:rPr>
+          <w:i/>
+          <w:iCs/>
+          <w:sz w:val="24"/>
+          <w:szCs w:val="24"/>
+        </w:rPr>
+        <w:t>RETR_CCOMP</w:t>
+      </w:r>
+      <w:r>
+        <w:rPr>
+          <w:sz w:val="24"/>
+          <w:szCs w:val="24"/>
+        </w:rPr>
+        <w:t xml:space="preserve"> returns a two-level hierarchy: external object boundaries and internal holes. We use this hierarchy in </w:t>
+      </w:r>
+      <w:r>
+        <w:rPr>
+          <w:i/>
+          <w:iCs/>
+          <w:sz w:val="24"/>
+          <w:szCs w:val="24"/>
+        </w:rPr>
+        <w:t>_</w:t>
+      </w:r>
+      <w:proofErr w:type="spellStart"/>
+      <w:r>
+        <w:rPr>
+          <w:i/>
+          <w:iCs/>
+          <w:sz w:val="24"/>
+          <w:szCs w:val="24"/>
+        </w:rPr>
+        <w:t>fill_holes</w:t>
+      </w:r>
+      <w:proofErr w:type="spellEnd"/>
+      <w:r>
+        <w:rPr>
+          <w:sz w:val="24"/>
+          <w:szCs w:val="24"/>
+        </w:rPr>
+        <w:t xml:space="preserve">: if a contour has a parent, it is an internal hole, and we draw it in white. </w:t>
+      </w:r>
+      <w:r>
+        <w:rPr>
+          <w:i/>
+          <w:iCs/>
+          <w:sz w:val="24"/>
+          <w:szCs w:val="24"/>
+        </w:rPr>
+        <w:t>RETR_EXTERNAL</w:t>
+      </w:r>
+      <w:r>
+        <w:rPr>
+          <w:sz w:val="24"/>
+          <w:szCs w:val="24"/>
+        </w:rPr>
+        <w:t xml:space="preserve"> is used later in </w:t>
+      </w:r>
+      <w:r>
+        <w:rPr>
+          <w:i/>
+          <w:iCs/>
+          <w:sz w:val="24"/>
+          <w:szCs w:val="24"/>
+        </w:rPr>
+        <w:t>_solidify</w:t>
+      </w:r>
+      <w:r>
+        <w:rPr>
+          <w:sz w:val="24"/>
+          <w:szCs w:val="24"/>
+        </w:rPr>
+        <w:t xml:space="preserve"> because at that point</w:t>
+      </w:r>
+      <w:r>
+        <w:rPr>
+          <w:sz w:val="24"/>
+          <w:szCs w:val="24"/>
+        </w:rPr>
+        <w:t>,</w:t>
+      </w:r>
+      <w:r>
+        <w:rPr>
+          <w:sz w:val="24"/>
+          <w:szCs w:val="24"/>
+        </w:rPr>
+        <w:t xml:space="preserve"> we only want the outer boundary of the selected person and not the inner holes.</w:t>
+      </w:r>
+    </w:p>
+    <w:p>
+      <w:pPr>
+        <w:pStyle w:val="a8"/>
+        <w:numPr>
+          <w:ilvl w:val="0"/>
+          <w:numId w:val="17"/>
+        </w:numPr>
+        <w:spacing w:after="120"/>
+        <w:rPr>
+          <w:i/>
+          <w:iCs/>
+          <w:sz w:val="24"/>
+          <w:szCs w:val="24"/>
+        </w:rPr>
+      </w:pPr>
+      <w:r>
+        <w:rPr>
+          <w:b/>
+          <w:i/>
+          <w:iCs/>
+          <w:sz w:val="24"/>
+          <w:szCs w:val="24"/>
+        </w:rPr>
+        <w:t>cv2.connectedComponentsWithStats</w:t>
+      </w:r>
+      <w:r>
+        <w:rPr>
+          <w:b/>
+          <w:i/>
+          <w:iCs/>
+          <w:sz w:val="24"/>
+          <w:szCs w:val="24"/>
+        </w:rPr>
+        <w:t>:</w:t>
+      </w:r>
+      <w:r>
+        <w:rPr>
+          <w:b/>
+          <w:sz w:val="24"/>
+          <w:szCs w:val="24"/>
+        </w:rPr>
+        <w:t xml:space="preserve"> </w:t>
+      </w:r>
+      <w:r>
+        <w:rPr>
+          <w:sz w:val="24"/>
+          <w:szCs w:val="24"/>
+        </w:rPr>
+        <w:t>After the mask is cleaned, it may still contain several disconnected foreground blobs. This function labels each connected white region and returns its area, bounding box, and centroid. We use those geometric measurements to choose the comp</w:t>
+      </w:r>
+      <w:r>
+        <w:rPr>
+          <w:sz w:val="24"/>
+          <w:szCs w:val="24"/>
+        </w:rPr>
+        <w:t xml:space="preserve">onent most likely to be the </w:t>
+      </w:r>
+      <w:r>
+        <w:rPr>
+          <w:sz w:val="24"/>
+          <w:szCs w:val="24"/>
+        </w:rPr>
+        <w:lastRenderedPageBreak/>
+        <w:t>person. The scoring function rewards large and tall components and penalizes sudden jumps in location, height, and width compared to the previous frame</w:t>
+      </w:r>
+      <w:r>
+        <w:rPr>
+          <w:sz w:val="24"/>
+          <w:szCs w:val="24"/>
+        </w:rPr>
+        <w:t>:</w:t>
+      </w:r>
+    </w:p>
+    <w:p>
+      <w:pPr>
+        <w:spacing w:before="80" w:after="80"/>
+        <w:jc w:val="center"/>
+        <w:rPr>
+          <w:sz w:val="24"/>
+          <w:szCs w:val="24"/>
+        </w:rPr>
+      </w:pPr>
+      <m:oMathPara>
+        <m:oMath>
+          <m:r>
+            <w:rPr>
+              <w:rFonts w:ascii="Cambria Math" w:hAnsi="Cambria Math"/>
+              <w:sz w:val="24"/>
+              <w:szCs w:val="24"/>
+            </w:rPr>
+            <m:t xml:space="preserve">score=area+70 · </m:t>
+          </m:r>
+          <m:r>
+            <w:rPr>
+              <w:rFonts w:ascii="Cambria Math" w:hAnsi="Cambria Math"/>
+              <w:sz w:val="24"/>
+              <w:szCs w:val="24"/>
+            </w:rPr>
+            <m:t>height-450·distance-25000 ·Δheight-12000· width</m:t>
+          </m:r>
+        </m:oMath>
+      </m:oMathPara>
+    </w:p>
+    <w:p>
+      <w:pPr>
+        <w:pStyle w:val="a8"/>
+        <w:numPr>
+          <w:ilvl w:val="0"/>
+          <w:numId w:val="17"/>
+        </w:numPr>
+        <w:spacing w:before="80" w:after="80"/>
+        <w:rPr>
+          <w:sz w:val="24"/>
+          <w:szCs w:val="24"/>
+        </w:rPr>
+      </w:pPr>
+      <w:r>
+        <w:rPr>
+          <w:b/>
+          <w:sz w:val="24"/>
+          <w:szCs w:val="24"/>
+        </w:rPr>
+        <w:t>Forward/backward mask fusion</w:t>
+      </w:r>
+      <w:r>
+        <w:rPr>
+          <w:b/>
+          <w:sz w:val="24"/>
+          <w:szCs w:val="24"/>
+        </w:rPr>
+        <w:t>:</w:t>
+      </w:r>
+      <w:r>
+        <w:rPr>
+          <w:b/>
+          <w:sz w:val="24"/>
+          <w:szCs w:val="24"/>
+        </w:rPr>
+        <w:t xml:space="preserve"> </w:t>
+      </w:r>
+      <w:r>
+        <w:rPr>
+          <w:sz w:val="24"/>
+          <w:szCs w:val="24"/>
+        </w:rPr>
+        <w:t>The algorithm computes one mask from the forward pass and one from the backward pass. If they overlap, the overlap is considered reliable foreground support. This preserves body pixels that appear in only one pass while rejecting distant leakage. If the masks do not overlap, we choose the smaller mask, because large masks usually indicate background contamination.</w:t>
+      </w:r>
+    </w:p>
+    <w:p>
+      <w:pPr>
+        <w:pStyle w:val="a8"/>
+        <w:numPr>
+          <w:ilvl w:val="0"/>
+          <w:numId w:val="17"/>
+        </w:numPr>
+        <w:spacing w:before="80" w:after="80"/>
+        <w:rPr>
+          <w:sz w:val="24"/>
+          <w:szCs w:val="24"/>
+        </w:rPr>
+      </w:pPr>
+      <w:r>
+        <w:rPr>
+          <w:b/>
+          <w:sz w:val="24"/>
+          <w:szCs w:val="24"/>
+        </w:rPr>
+        <w:t>Border suppression</w:t>
+      </w:r>
+      <w:r>
+        <w:rPr>
+          <w:b/>
+          <w:sz w:val="24"/>
+          <w:szCs w:val="24"/>
+        </w:rPr>
+        <w:t>:</w:t>
+      </w:r>
+      <w:r>
+        <w:rPr>
+          <w:b/>
+          <w:sz w:val="24"/>
+          <w:szCs w:val="24"/>
+        </w:rPr>
+        <w:t xml:space="preserve"> </w:t>
+      </w:r>
+      <w:r>
+        <w:rPr>
+          <w:sz w:val="24"/>
+          <w:szCs w:val="24"/>
+        </w:rPr>
+        <w:t>The stabilized video may contain unstable pixels at the image boundaries due to warping</w:t>
+      </w:r>
+      <w:r>
+        <w:rPr>
+          <w:sz w:val="24"/>
+          <w:szCs w:val="24"/>
+        </w:rPr>
+        <w:t xml:space="preserve"> (which is performed at the stabilization stage)</w:t>
+      </w:r>
+      <w:r>
+        <w:rPr>
+          <w:sz w:val="24"/>
+          <w:szCs w:val="24"/>
+        </w:rPr>
+        <w:t xml:space="preserve">. </w:t>
+      </w:r>
+      <w:r>
+        <w:rPr>
+          <w:sz w:val="24"/>
+          <w:szCs w:val="24"/>
+        </w:rPr>
+        <w:t>t</w:t>
+      </w:r>
+      <w:r>
+        <w:rPr>
+          <w:sz w:val="24"/>
+          <w:szCs w:val="24"/>
+        </w:rPr>
+        <w:t xml:space="preserve">hese border pixels frequently appear as false motion. Therefore, before connected component analysis, we explicitly set a fixed margin around the frame to zero. </w:t>
+      </w:r>
+    </w:p>
+    <w:p>
+      <w:pPr>
+        <w:spacing w:after="120"/>
+        <w:rPr>
+          <w:rFonts w:asciiTheme="minorBidi" w:hAnsiTheme="minorBidi" w:cstheme="minorBidi"/>
+          <w:sz w:val="24"/>
+          <w:szCs w:val="24"/>
         </w:rPr>
       </w:pPr>
     </w:p>
@@ -2281,6 +3662,187 @@
     </w:lvl>
   </w:abstractNum>
   <w:abstractNum w:abstractNumId="2" w15:restartNumberingAfterBreak="0">
+    <w:nsid w:val="0BD63464"/>
+    <w:multiLevelType w:val="hybridMultilevel"/>
+    <w:tmpl w:val="65B2BDD2"/>
+    <w:lvl w:ilvl="0" w:tplc="95DC8C60">
+      <w:start w:val="1"/>
+      <w:numFmt w:val="decimal"/>
+      <w:lvlText w:val="%1."/>
+      <w:lvlJc w:val="left"/>
+      <w:pPr>
+        <w:ind w:left="720" w:hanging="360"/>
+      </w:pPr>
+      <w:rPr>
+        <w:rFonts w:hint="default"/>
+        <w:b w:val="0"/>
+        <w:bCs w:val="0"/>
+      </w:rPr>
+    </w:lvl>
+    <w:lvl w:ilvl="1" w:tplc="04090019" w:tentative="1">
+      <w:start w:val="1"/>
+      <w:numFmt w:val="lowerLetter"/>
+      <w:lvlText w:val="%2."/>
+      <w:lvlJc w:val="left"/>
+      <w:pPr>
+        <w:ind w:left="1440" w:hanging="360"/>
+      </w:pPr>
+    </w:lvl>
+    <w:lvl w:ilvl="2" w:tplc="0409001B" w:tentative="1">
+      <w:start w:val="1"/>
+      <w:numFmt w:val="lowerRoman"/>
+      <w:lvlText w:val="%3."/>
+      <w:lvlJc w:val="right"/>
+      <w:pPr>
+        <w:ind w:left="2160" w:hanging="180"/>
+      </w:pPr>
+    </w:lvl>
+    <w:lvl w:ilvl="3" w:tplc="0409000F" w:tentative="1">
+      <w:start w:val="1"/>
+      <w:numFmt w:val="decimal"/>
+      <w:lvlText w:val="%4."/>
+      <w:lvlJc w:val="left"/>
+      <w:pPr>
+        <w:ind w:left="2880" w:hanging="360"/>
+      </w:pPr>
+    </w:lvl>
+    <w:lvl w:ilvl="4" w:tplc="04090019" w:tentative="1">
+      <w:start w:val="1"/>
+      <w:numFmt w:val="lowerLetter"/>
+      <w:lvlText w:val="%5."/>
+      <w:lvlJc w:val="left"/>
+      <w:pPr>
+        <w:ind w:left="3600" w:hanging="360"/>
+      </w:pPr>
+    </w:lvl>
+    <w:lvl w:ilvl="5" w:tplc="0409001B" w:tentative="1">
+      <w:start w:val="1"/>
+      <w:numFmt w:val="lowerRoman"/>
+      <w:lvlText w:val="%6."/>
+      <w:lvlJc w:val="right"/>
+      <w:pPr>
+        <w:ind w:left="4320" w:hanging="180"/>
+      </w:pPr>
+    </w:lvl>
+    <w:lvl w:ilvl="6" w:tplc="0409000F" w:tentative="1">
+      <w:start w:val="1"/>
+      <w:numFmt w:val="decimal"/>
+      <w:lvlText w:val="%7."/>
+      <w:lvlJc w:val="left"/>
+      <w:pPr>
+        <w:ind w:left="5040" w:hanging="360"/>
+      </w:pPr>
+    </w:lvl>
+    <w:lvl w:ilvl="7" w:tplc="04090019" w:tentative="1">
+      <w:start w:val="1"/>
+      <w:numFmt w:val="lowerLetter"/>
+      <w:lvlText w:val="%8."/>
+      <w:lvlJc w:val="left"/>
+      <w:pPr>
+        <w:ind w:left="5760" w:hanging="360"/>
+      </w:pPr>
+    </w:lvl>
+    <w:lvl w:ilvl="8" w:tplc="0409001B" w:tentative="1">
+      <w:start w:val="1"/>
+      <w:numFmt w:val="lowerRoman"/>
+      <w:lvlText w:val="%9."/>
+      <w:lvlJc w:val="right"/>
+      <w:pPr>
+        <w:ind w:left="6480" w:hanging="180"/>
+      </w:pPr>
+    </w:lvl>
+  </w:abstractNum>
+  <w:abstractNum w:abstractNumId="3" w15:restartNumberingAfterBreak="0">
+    <w:nsid w:val="161B3141"/>
+    <w:multiLevelType w:val="multilevel"/>
+    <w:tmpl w:val="87A658CA"/>
+    <w:styleLink w:val="1"/>
+    <w:lvl w:ilvl="0">
+      <w:start w:val="1"/>
+      <w:numFmt w:val="decimal"/>
+      <w:lvlText w:val="%1."/>
+      <w:lvlJc w:val="left"/>
+      <w:pPr>
+        <w:ind w:left="720" w:hanging="360"/>
+      </w:pPr>
+      <w:rPr>
+        <w:rFonts w:ascii="Aptos" w:eastAsia="Aptos" w:hAnsi="Aptos" w:cs="Aptos"/>
+      </w:rPr>
+    </w:lvl>
+    <w:lvl w:ilvl="1">
+      <w:start w:val="1"/>
+      <w:numFmt w:val="lowerLetter"/>
+      <w:lvlText w:val="%2."/>
+      <w:lvlJc w:val="left"/>
+      <w:pPr>
+        <w:ind w:left="1440" w:hanging="360"/>
+      </w:pPr>
+    </w:lvl>
+    <w:lvl w:ilvl="2">
+      <w:start w:val="1"/>
+      <w:numFmt w:val="lowerRoman"/>
+      <w:lvlText w:val="%3."/>
+      <w:lvlJc w:val="right"/>
+      <w:pPr>
+        <w:ind w:left="2160" w:hanging="180"/>
+      </w:pPr>
+    </w:lvl>
+    <w:lvl w:ilvl="3">
+      <w:start w:val="1"/>
+      <w:numFmt w:val="decimal"/>
+      <w:lvlText w:val="%4."/>
+      <w:lvlJc w:val="left"/>
+      <w:pPr>
+        <w:ind w:left="2880" w:hanging="360"/>
+      </w:pPr>
+    </w:lvl>
+    <w:lvl w:ilvl="4">
+      <w:start w:val="1"/>
+      <w:numFmt w:val="lowerLetter"/>
+      <w:lvlText w:val="%5."/>
+      <w:lvlJc w:val="left"/>
+      <w:pPr>
+        <w:ind w:left="3600" w:hanging="360"/>
+      </w:pPr>
+    </w:lvl>
+    <w:lvl w:ilvl="5">
+      <w:start w:val="1"/>
+      <w:numFmt w:val="lowerRoman"/>
+      <w:lvlText w:val="%6."/>
+      <w:lvlJc w:val="right"/>
+      <w:pPr>
+        <w:ind w:left="4320" w:hanging="180"/>
+      </w:pPr>
+    </w:lvl>
+    <w:lvl w:ilvl="6">
+      <w:start w:val="1"/>
+      <w:numFmt w:val="decimal"/>
+      <w:lvlText w:val="%7."/>
+      <w:lvlJc w:val="left"/>
+      <w:pPr>
+        <w:ind w:left="5040" w:hanging="360"/>
+      </w:pPr>
+    </w:lvl>
+    <w:lvl w:ilvl="7">
+      <w:start w:val="1"/>
+      <w:numFmt w:val="lowerLetter"/>
+      <w:lvlText w:val="%8."/>
+      <w:lvlJc w:val="left"/>
+      <w:pPr>
+        <w:ind w:left="5760" w:hanging="360"/>
+      </w:pPr>
+    </w:lvl>
+    <w:lvl w:ilvl="8">
+      <w:start w:val="1"/>
+      <w:numFmt w:val="lowerRoman"/>
+      <w:lvlText w:val="%9."/>
+      <w:lvlJc w:val="right"/>
+      <w:pPr>
+        <w:ind w:left="6480" w:hanging="180"/>
+      </w:pPr>
+    </w:lvl>
+  </w:abstractNum>
+  <w:abstractNum w:abstractNumId="4" w15:restartNumberingAfterBreak="0">
     <w:nsid w:val="1C38374B"/>
     <w:multiLevelType w:val="hybridMultilevel"/>
     <w:tmpl w:val="3E8E1B6C"/>
@@ -2369,7 +3931,96 @@
       </w:pPr>
     </w:lvl>
   </w:abstractNum>
-  <w:abstractNum w:abstractNumId="3" w15:restartNumberingAfterBreak="0">
+  <w:abstractNum w:abstractNumId="5" w15:restartNumberingAfterBreak="0">
+    <w:nsid w:val="23565224"/>
+    <w:multiLevelType w:val="hybridMultilevel"/>
+    <w:tmpl w:val="32345886"/>
+    <w:lvl w:ilvl="0" w:tplc="FFFFFFFF">
+      <w:start w:val="1"/>
+      <w:numFmt w:val="decimal"/>
+      <w:lvlText w:val="%1."/>
+      <w:lvlJc w:val="left"/>
+      <w:pPr>
+        <w:ind w:left="720" w:hanging="360"/>
+      </w:pPr>
+      <w:rPr>
+        <w:rFonts w:hint="default"/>
+      </w:rPr>
+    </w:lvl>
+    <w:lvl w:ilvl="1" w:tplc="FFFFFFFF">
+      <w:start w:val="1"/>
+      <w:numFmt w:val="lowerLetter"/>
+      <w:lvlText w:val="%2."/>
+      <w:lvlJc w:val="left"/>
+      <w:pPr>
+        <w:ind w:left="1440" w:hanging="360"/>
+      </w:pPr>
+    </w:lvl>
+    <w:lvl w:ilvl="2" w:tplc="FFFFFFFF" w:tentative="1">
+      <w:start w:val="1"/>
+      <w:numFmt w:val="lowerRoman"/>
+      <w:lvlText w:val="%3."/>
+      <w:lvlJc w:val="right"/>
+      <w:pPr>
+        <w:ind w:left="2160" w:hanging="180"/>
+      </w:pPr>
+    </w:lvl>
+    <w:lvl w:ilvl="3" w:tplc="FFFFFFFF" w:tentative="1">
+      <w:start w:val="1"/>
+      <w:numFmt w:val="decimal"/>
+      <w:lvlText w:val="%4."/>
+      <w:lvlJc w:val="left"/>
+      <w:pPr>
+        <w:ind w:left="2880" w:hanging="360"/>
+      </w:pPr>
+    </w:lvl>
+    <w:lvl w:ilvl="4" w:tplc="FFFFFFFF" w:tentative="1">
+      <w:start w:val="1"/>
+      <w:numFmt w:val="lowerLetter"/>
+      <w:lvlText w:val="%5."/>
+      <w:lvlJc w:val="left"/>
+      <w:pPr>
+        <w:ind w:left="3600" w:hanging="360"/>
+      </w:pPr>
+    </w:lvl>
+    <w:lvl w:ilvl="5" w:tplc="FFFFFFFF" w:tentative="1">
+      <w:start w:val="1"/>
+      <w:numFmt w:val="lowerRoman"/>
+      <w:lvlText w:val="%6."/>
+      <w:lvlJc w:val="right"/>
+      <w:pPr>
+        <w:ind w:left="4320" w:hanging="180"/>
+      </w:pPr>
+    </w:lvl>
+    <w:lvl w:ilvl="6" w:tplc="FFFFFFFF" w:tentative="1">
+      <w:start w:val="1"/>
+      <w:numFmt w:val="decimal"/>
+      <w:lvlText w:val="%7."/>
+      <w:lvlJc w:val="left"/>
+      <w:pPr>
+        <w:ind w:left="5040" w:hanging="360"/>
+      </w:pPr>
+    </w:lvl>
+    <w:lvl w:ilvl="7" w:tplc="FFFFFFFF" w:tentative="1">
+      <w:start w:val="1"/>
+      <w:numFmt w:val="lowerLetter"/>
+      <w:lvlText w:val="%8."/>
+      <w:lvlJc w:val="left"/>
+      <w:pPr>
+        <w:ind w:left="5760" w:hanging="360"/>
+      </w:pPr>
+    </w:lvl>
+    <w:lvl w:ilvl="8" w:tplc="FFFFFFFF" w:tentative="1">
+      <w:start w:val="1"/>
+      <w:numFmt w:val="lowerRoman"/>
+      <w:lvlText w:val="%9."/>
+      <w:lvlJc w:val="right"/>
+      <w:pPr>
+        <w:ind w:left="6480" w:hanging="180"/>
+      </w:pPr>
+    </w:lvl>
+  </w:abstractNum>
+  <w:abstractNum w:abstractNumId="6" w15:restartNumberingAfterBreak="0">
     <w:nsid w:val="41145BAA"/>
     <w:multiLevelType w:val="multilevel"/>
     <w:tmpl w:val="C1C2E09C"/>
@@ -2500,7 +4151,7 @@
       </w:rPr>
     </w:lvl>
   </w:abstractNum>
-  <w:abstractNum w:abstractNumId="4" w15:restartNumberingAfterBreak="0">
+  <w:abstractNum w:abstractNumId="7" w15:restartNumberingAfterBreak="0">
     <w:nsid w:val="42D11D26"/>
     <w:multiLevelType w:val="multilevel"/>
     <w:tmpl w:val="E5AA3D62"/>
@@ -2649,7 +4300,7 @@
       </w:rPr>
     </w:lvl>
   </w:abstractNum>
-  <w:abstractNum w:abstractNumId="5" w15:restartNumberingAfterBreak="0">
+  <w:abstractNum w:abstractNumId="8" w15:restartNumberingAfterBreak="0">
     <w:nsid w:val="43264BF8"/>
     <w:multiLevelType w:val="hybridMultilevel"/>
     <w:tmpl w:val="AA7025EA"/>
@@ -2738,7 +4389,7 @@
       </w:pPr>
     </w:lvl>
   </w:abstractNum>
-  <w:abstractNum w:abstractNumId="6" w15:restartNumberingAfterBreak="0">
+  <w:abstractNum w:abstractNumId="9" w15:restartNumberingAfterBreak="0">
     <w:nsid w:val="43346C29"/>
     <w:multiLevelType w:val="multilevel"/>
     <w:tmpl w:val="6FE2CD64"/>
@@ -2851,7 +4502,7 @@
       </w:rPr>
     </w:lvl>
   </w:abstractNum>
-  <w:abstractNum w:abstractNumId="7" w15:restartNumberingAfterBreak="0">
+  <w:abstractNum w:abstractNumId="10" w15:restartNumberingAfterBreak="0">
     <w:nsid w:val="4337606B"/>
     <w:multiLevelType w:val="multilevel"/>
     <w:tmpl w:val="82E8695A"/>
@@ -3000,7 +4651,96 @@
       </w:rPr>
     </w:lvl>
   </w:abstractNum>
-  <w:abstractNum w:abstractNumId="8" w15:restartNumberingAfterBreak="0">
+  <w:abstractNum w:abstractNumId="11" w15:restartNumberingAfterBreak="0">
+    <w:nsid w:val="48CB5C36"/>
+    <w:multiLevelType w:val="hybridMultilevel"/>
+    <w:tmpl w:val="32345886"/>
+    <w:lvl w:ilvl="0" w:tplc="0409000F">
+      <w:start w:val="1"/>
+      <w:numFmt w:val="decimal"/>
+      <w:lvlText w:val="%1."/>
+      <w:lvlJc w:val="left"/>
+      <w:pPr>
+        <w:ind w:left="720" w:hanging="360"/>
+      </w:pPr>
+      <w:rPr>
+        <w:rFonts w:hint="default"/>
+      </w:rPr>
+    </w:lvl>
+    <w:lvl w:ilvl="1" w:tplc="04090019" w:tentative="1">
+      <w:start w:val="1"/>
+      <w:numFmt w:val="lowerLetter"/>
+      <w:lvlText w:val="%2."/>
+      <w:lvlJc w:val="left"/>
+      <w:pPr>
+        <w:ind w:left="1440" w:hanging="360"/>
+      </w:pPr>
+    </w:lvl>
+    <w:lvl w:ilvl="2" w:tplc="0409001B" w:tentative="1">
+      <w:start w:val="1"/>
+      <w:numFmt w:val="lowerRoman"/>
+      <w:lvlText w:val="%3."/>
+      <w:lvlJc w:val="right"/>
+      <w:pPr>
+        <w:ind w:left="2160" w:hanging="180"/>
+      </w:pPr>
+    </w:lvl>
+    <w:lvl w:ilvl="3" w:tplc="0409000F" w:tentative="1">
+      <w:start w:val="1"/>
+      <w:numFmt w:val="decimal"/>
+      <w:lvlText w:val="%4."/>
+      <w:lvlJc w:val="left"/>
+      <w:pPr>
+        <w:ind w:left="2880" w:hanging="360"/>
+      </w:pPr>
+    </w:lvl>
+    <w:lvl w:ilvl="4" w:tplc="04090019" w:tentative="1">
+      <w:start w:val="1"/>
+      <w:numFmt w:val="lowerLetter"/>
+      <w:lvlText w:val="%5."/>
+      <w:lvlJc w:val="left"/>
+      <w:pPr>
+        <w:ind w:left="3600" w:hanging="360"/>
+      </w:pPr>
+    </w:lvl>
+    <w:lvl w:ilvl="5" w:tplc="0409001B" w:tentative="1">
+      <w:start w:val="1"/>
+      <w:numFmt w:val="lowerRoman"/>
+      <w:lvlText w:val="%6."/>
+      <w:lvlJc w:val="right"/>
+      <w:pPr>
+        <w:ind w:left="4320" w:hanging="180"/>
+      </w:pPr>
+    </w:lvl>
+    <w:lvl w:ilvl="6" w:tplc="0409000F" w:tentative="1">
+      <w:start w:val="1"/>
+      <w:numFmt w:val="decimal"/>
+      <w:lvlText w:val="%7."/>
+      <w:lvlJc w:val="left"/>
+      <w:pPr>
+        <w:ind w:left="5040" w:hanging="360"/>
+      </w:pPr>
+    </w:lvl>
+    <w:lvl w:ilvl="7" w:tplc="04090019" w:tentative="1">
+      <w:start w:val="1"/>
+      <w:numFmt w:val="lowerLetter"/>
+      <w:lvlText w:val="%8."/>
+      <w:lvlJc w:val="left"/>
+      <w:pPr>
+        <w:ind w:left="5760" w:hanging="360"/>
+      </w:pPr>
+    </w:lvl>
+    <w:lvl w:ilvl="8" w:tplc="0409001B" w:tentative="1">
+      <w:start w:val="1"/>
+      <w:numFmt w:val="lowerRoman"/>
+      <w:lvlText w:val="%9."/>
+      <w:lvlJc w:val="right"/>
+      <w:pPr>
+        <w:ind w:left="6480" w:hanging="180"/>
+      </w:pPr>
+    </w:lvl>
+  </w:abstractNum>
+  <w:abstractNum w:abstractNumId="12" w15:restartNumberingAfterBreak="0">
     <w:nsid w:val="4C535AE5"/>
     <w:multiLevelType w:val="hybridMultilevel"/>
     <w:tmpl w:val="8160DBE2"/>
@@ -3089,11 +4829,11 @@
       </w:pPr>
     </w:lvl>
   </w:abstractNum>
-  <w:abstractNum w:abstractNumId="9" w15:restartNumberingAfterBreak="0">
-    <w:nsid w:val="60225259"/>
+  <w:abstractNum w:abstractNumId="13" w15:restartNumberingAfterBreak="0">
+    <w:nsid w:val="5A9B2958"/>
     <w:multiLevelType w:val="hybridMultilevel"/>
-    <w:tmpl w:val="F154A642"/>
-    <w:lvl w:ilvl="0" w:tplc="0409000F">
+    <w:tmpl w:val="32345886"/>
+    <w:lvl w:ilvl="0" w:tplc="FFFFFFFF">
       <w:start w:val="1"/>
       <w:numFmt w:val="decimal"/>
       <w:lvlText w:val="%1."/>
@@ -3105,7 +4845,7 @@
         <w:rFonts w:hint="default"/>
       </w:rPr>
     </w:lvl>
-    <w:lvl w:ilvl="1" w:tplc="04090019">
+    <w:lvl w:ilvl="1" w:tplc="FFFFFFFF" w:tentative="1">
       <w:start w:val="1"/>
       <w:numFmt w:val="lowerLetter"/>
       <w:lvlText w:val="%2."/>
@@ -3114,7 +4854,7 @@
         <w:ind w:left="1440" w:hanging="360"/>
       </w:pPr>
     </w:lvl>
-    <w:lvl w:ilvl="2" w:tplc="0409001B" w:tentative="1">
+    <w:lvl w:ilvl="2" w:tplc="FFFFFFFF" w:tentative="1">
       <w:start w:val="1"/>
       <w:numFmt w:val="lowerRoman"/>
       <w:lvlText w:val="%3."/>
@@ -3123,7 +4863,7 @@
         <w:ind w:left="2160" w:hanging="180"/>
       </w:pPr>
     </w:lvl>
-    <w:lvl w:ilvl="3" w:tplc="0409000F" w:tentative="1">
+    <w:lvl w:ilvl="3" w:tplc="FFFFFFFF" w:tentative="1">
       <w:start w:val="1"/>
       <w:numFmt w:val="decimal"/>
       <w:lvlText w:val="%4."/>
@@ -3132,7 +4872,7 @@
         <w:ind w:left="2880" w:hanging="360"/>
       </w:pPr>
     </w:lvl>
-    <w:lvl w:ilvl="4" w:tplc="04090019" w:tentative="1">
+    <w:lvl w:ilvl="4" w:tplc="FFFFFFFF" w:tentative="1">
       <w:start w:val="1"/>
       <w:numFmt w:val="lowerLetter"/>
       <w:lvlText w:val="%5."/>
@@ -3141,7 +4881,7 @@
         <w:ind w:left="3600" w:hanging="360"/>
       </w:pPr>
     </w:lvl>
-    <w:lvl w:ilvl="5" w:tplc="0409001B" w:tentative="1">
+    <w:lvl w:ilvl="5" w:tplc="FFFFFFFF" w:tentative="1">
       <w:start w:val="1"/>
       <w:numFmt w:val="lowerRoman"/>
       <w:lvlText w:val="%6."/>
@@ -3150,7 +4890,7 @@
         <w:ind w:left="4320" w:hanging="180"/>
       </w:pPr>
     </w:lvl>
-    <w:lvl w:ilvl="6" w:tplc="0409000F" w:tentative="1">
+    <w:lvl w:ilvl="6" w:tplc="FFFFFFFF" w:tentative="1">
       <w:start w:val="1"/>
       <w:numFmt w:val="decimal"/>
       <w:lvlText w:val="%7."/>
@@ -3159,7 +4899,7 @@
         <w:ind w:left="5040" w:hanging="360"/>
       </w:pPr>
     </w:lvl>
-    <w:lvl w:ilvl="7" w:tplc="04090019" w:tentative="1">
+    <w:lvl w:ilvl="7" w:tplc="FFFFFFFF" w:tentative="1">
       <w:start w:val="1"/>
       <w:numFmt w:val="lowerLetter"/>
       <w:lvlText w:val="%8."/>
@@ -3168,7 +4908,7 @@
         <w:ind w:left="5760" w:hanging="360"/>
       </w:pPr>
     </w:lvl>
-    <w:lvl w:ilvl="8" w:tplc="0409001B" w:tentative="1">
+    <w:lvl w:ilvl="8" w:tplc="FFFFFFFF" w:tentative="1">
       <w:start w:val="1"/>
       <w:numFmt w:val="lowerRoman"/>
       <w:lvlText w:val="%9."/>
@@ -3178,10 +4918,105 @@
       </w:pPr>
     </w:lvl>
   </w:abstractNum>
-  <w:abstractNum w:abstractNumId="10" w15:restartNumberingAfterBreak="0">
+  <w:abstractNum w:abstractNumId="14" w15:restartNumberingAfterBreak="0">
+    <w:nsid w:val="60225259"/>
+    <w:multiLevelType w:val="hybridMultilevel"/>
+    <w:tmpl w:val="24F2BE3A"/>
+    <w:lvl w:ilvl="0" w:tplc="7E38B80A">
+      <w:start w:val="1"/>
+      <w:numFmt w:val="decimal"/>
+      <w:lvlText w:val="%1."/>
+      <w:lvlJc w:val="left"/>
+      <w:pPr>
+        <w:ind w:left="720" w:hanging="360"/>
+      </w:pPr>
+      <w:rPr>
+        <w:rFonts w:ascii="Aptos" w:eastAsia="Aptos" w:hAnsi="Aptos" w:cs="Aptos"/>
+        <w:b w:val="0"/>
+        <w:bCs w:val="0"/>
+      </w:rPr>
+    </w:lvl>
+    <w:lvl w:ilvl="1" w:tplc="522CF5F4">
+      <w:start w:val="1"/>
+      <w:numFmt w:val="lowerLetter"/>
+      <w:lvlText w:val="%2."/>
+      <w:lvlJc w:val="left"/>
+      <w:pPr>
+        <w:ind w:left="1440" w:hanging="360"/>
+      </w:pPr>
+      <w:rPr>
+        <w:b w:val="0"/>
+        <w:bCs w:val="0"/>
+      </w:rPr>
+    </w:lvl>
+    <w:lvl w:ilvl="2" w:tplc="0409001B" w:tentative="1">
+      <w:start w:val="1"/>
+      <w:numFmt w:val="lowerRoman"/>
+      <w:lvlText w:val="%3."/>
+      <w:lvlJc w:val="right"/>
+      <w:pPr>
+        <w:ind w:left="2160" w:hanging="180"/>
+      </w:pPr>
+    </w:lvl>
+    <w:lvl w:ilvl="3" w:tplc="0409000F" w:tentative="1">
+      <w:start w:val="1"/>
+      <w:numFmt w:val="decimal"/>
+      <w:lvlText w:val="%4."/>
+      <w:lvlJc w:val="left"/>
+      <w:pPr>
+        <w:ind w:left="2880" w:hanging="360"/>
+      </w:pPr>
+    </w:lvl>
+    <w:lvl w:ilvl="4" w:tplc="04090019" w:tentative="1">
+      <w:start w:val="1"/>
+      <w:numFmt w:val="lowerLetter"/>
+      <w:lvlText w:val="%5."/>
+      <w:lvlJc w:val="left"/>
+      <w:pPr>
+        <w:ind w:left="3600" w:hanging="360"/>
+      </w:pPr>
+    </w:lvl>
+    <w:lvl w:ilvl="5" w:tplc="0409001B" w:tentative="1">
+      <w:start w:val="1"/>
+      <w:numFmt w:val="lowerRoman"/>
+      <w:lvlText w:val="%6."/>
+      <w:lvlJc w:val="right"/>
+      <w:pPr>
+        <w:ind w:left="4320" w:hanging="180"/>
+      </w:pPr>
+    </w:lvl>
+    <w:lvl w:ilvl="6" w:tplc="0409000F" w:tentative="1">
+      <w:start w:val="1"/>
+      <w:numFmt w:val="decimal"/>
+      <w:lvlText w:val="%7."/>
+      <w:lvlJc w:val="left"/>
+      <w:pPr>
+        <w:ind w:left="5040" w:hanging="360"/>
+      </w:pPr>
+    </w:lvl>
+    <w:lvl w:ilvl="7" w:tplc="04090019" w:tentative="1">
+      <w:start w:val="1"/>
+      <w:numFmt w:val="lowerLetter"/>
+      <w:lvlText w:val="%8."/>
+      <w:lvlJc w:val="left"/>
+      <w:pPr>
+        <w:ind w:left="5760" w:hanging="360"/>
+      </w:pPr>
+    </w:lvl>
+    <w:lvl w:ilvl="8" w:tplc="0409001B" w:tentative="1">
+      <w:start w:val="1"/>
+      <w:numFmt w:val="lowerRoman"/>
+      <w:lvlText w:val="%9."/>
+      <w:lvlJc w:val="right"/>
+      <w:pPr>
+        <w:ind w:left="6480" w:hanging="180"/>
+      </w:pPr>
+    </w:lvl>
+  </w:abstractNum>
+  <w:abstractNum w:abstractNumId="15" w15:restartNumberingAfterBreak="0">
     <w:nsid w:val="6DB75597"/>
     <w:multiLevelType w:val="multilevel"/>
-    <w:tmpl w:val="EB4202BA"/>
+    <w:tmpl w:val="F3C44056"/>
     <w:lvl w:ilvl="0">
       <w:start w:val="1"/>
       <w:numFmt w:val="decimal"/>
@@ -3198,23 +5033,19 @@
         <w:sz w:val="20"/>
       </w:rPr>
     </w:lvl>
-    <w:lvl w:ilvl="1" w:tentative="1">
-      <w:start w:val="1"/>
-      <w:numFmt w:val="bullet"/>
-      <w:lvlText w:val="o"/>
-      <w:lvlJc w:val="left"/>
-      <w:pPr>
-        <w:tabs>
-          <w:tab w:val="num" w:pos="1440"/>
-        </w:tabs>
+    <w:lvl w:ilvl="1">
+      <w:start w:val="1"/>
+      <w:numFmt w:val="decimal"/>
+      <w:lvlText w:val="%2."/>
+      <w:lvlJc w:val="left"/>
+      <w:pPr>
         <w:ind w:left="1440" w:hanging="360"/>
       </w:pPr>
       <w:rPr>
-        <w:rFonts w:ascii="Courier New" w:hAnsi="Courier New" w:hint="default"/>
-        <w:sz w:val="20"/>
-      </w:rPr>
-    </w:lvl>
-    <w:lvl w:ilvl="2" w:tentative="1">
+        <w:rFonts w:ascii="Aptos" w:eastAsia="Aptos" w:hAnsi="Aptos" w:cs="Aptos"/>
+      </w:rPr>
+    </w:lvl>
+    <w:lvl w:ilvl="2">
       <w:start w:val="1"/>
       <w:numFmt w:val="bullet"/>
       <w:lvlText w:val=""/>
@@ -3230,7 +5061,7 @@
         <w:sz w:val="20"/>
       </w:rPr>
     </w:lvl>
-    <w:lvl w:ilvl="3" w:tentative="1">
+    <w:lvl w:ilvl="3">
       <w:start w:val="1"/>
       <w:numFmt w:val="bullet"/>
       <w:lvlText w:val=""/>
@@ -3327,7 +5158,7 @@
       </w:rPr>
     </w:lvl>
   </w:abstractNum>
-  <w:abstractNum w:abstractNumId="11" w15:restartNumberingAfterBreak="0">
+  <w:abstractNum w:abstractNumId="16" w15:restartNumberingAfterBreak="0">
     <w:nsid w:val="70CF01B9"/>
     <w:multiLevelType w:val="multilevel"/>
     <w:tmpl w:val="8CB0C348"/>
@@ -3477,40 +5308,55 @@
     </w:lvl>
   </w:abstractNum>
   <w:num w:numId="1" w16cid:durableId="1273830004">
-    <w:abstractNumId w:val="3"/>
+    <w:abstractNumId w:val="6"/>
   </w:num>
   <w:num w:numId="2" w16cid:durableId="1648896190">
-    <w:abstractNumId w:val="6"/>
+    <w:abstractNumId w:val="9"/>
   </w:num>
   <w:num w:numId="3" w16cid:durableId="572549868">
-    <w:abstractNumId w:val="8"/>
+    <w:abstractNumId w:val="12"/>
   </w:num>
   <w:num w:numId="4" w16cid:durableId="232594315">
-    <w:abstractNumId w:val="5"/>
+    <w:abstractNumId w:val="8"/>
   </w:num>
   <w:num w:numId="5" w16cid:durableId="899632343">
     <w:abstractNumId w:val="1"/>
   </w:num>
   <w:num w:numId="6" w16cid:durableId="406997307">
-    <w:abstractNumId w:val="2"/>
+    <w:abstractNumId w:val="4"/>
   </w:num>
   <w:num w:numId="7" w16cid:durableId="253587797">
-    <w:abstractNumId w:val="7"/>
+    <w:abstractNumId w:val="10"/>
   </w:num>
   <w:num w:numId="8" w16cid:durableId="588738717">
-    <w:abstractNumId w:val="4"/>
+    <w:abstractNumId w:val="7"/>
   </w:num>
   <w:num w:numId="9" w16cid:durableId="1175732347">
     <w:abstractNumId w:val="0"/>
   </w:num>
   <w:num w:numId="10" w16cid:durableId="1144854598">
-    <w:abstractNumId w:val="10"/>
+    <w:abstractNumId w:val="15"/>
   </w:num>
   <w:num w:numId="11" w16cid:durableId="213347259">
+    <w:abstractNumId w:val="16"/>
+  </w:num>
+  <w:num w:numId="12" w16cid:durableId="81951011">
+    <w:abstractNumId w:val="14"/>
+  </w:num>
+  <w:num w:numId="13" w16cid:durableId="724450366">
+    <w:abstractNumId w:val="2"/>
+  </w:num>
+  <w:num w:numId="14" w16cid:durableId="885872335">
     <w:abstractNumId w:val="11"/>
   </w:num>
-  <w:num w:numId="12" w16cid:durableId="81951011">
-    <w:abstractNumId w:val="9"/>
+  <w:num w:numId="15" w16cid:durableId="990132565">
+    <w:abstractNumId w:val="3"/>
+  </w:num>
+  <w:num w:numId="16" w16cid:durableId="2034262400">
+    <w:abstractNumId w:val="5"/>
+  </w:num>
+  <w:num w:numId="17" w16cid:durableId="1234659660">
+    <w:abstractNumId w:val="13"/>
   </w:num>
 </w:numbering>
 </file>
@@ -3914,7 +5760,7 @@
     <w:name w:val="Normal"/>
     <w:qFormat/>
   </w:style>
-  <w:style w:type="paragraph" w:styleId="1">
+  <w:style w:type="paragraph" w:styleId="10">
     <w:name w:val="heading 1"/>
     <w:basedOn w:val="a"/>
     <w:next w:val="a"/>
@@ -4092,6 +5938,7 @@
   <w:style w:type="character" w:default="1" w:styleId="a0">
     <w:name w:val="Default Paragraph Font"/>
     <w:uiPriority w:val="1"/>
+    <w:semiHidden/>
     <w:unhideWhenUsed/>
   </w:style>
   <w:style w:type="table" w:default="1" w:styleId="a1">
@@ -4219,7 +6066,7 @@
       <w:lang w:val="en-US"/>
     </w:rPr>
   </w:style>
-  <w:style w:type="character" w:customStyle="1" w:styleId="10">
+  <w:style w:type="character" w:customStyle="1" w:styleId="11">
     <w:name w:val="כותרת 1 תו"/>
     <w:basedOn w:val="a0"/>
     <w:uiPriority w:val="9"/>
@@ -4567,6 +6414,16 @@
       <w:szCs w:val="20"/>
     </w:rPr>
   </w:style>
+  <w:style w:type="numbering" w:customStyle="1" w:styleId="1">
+    <w:name w:val="רשימה נוכחית1"/>
+    <w:uiPriority w:val="99"/>
+    <w:rsid w:val="00F4424E"/>
+    <w:pPr>
+      <w:numPr>
+        <w:numId w:val="15"/>
+      </w:numPr>
+    </w:pPr>
+  </w:style>
 </w:styles>
 </file>
 

</xml_diff>

<commit_message>
fixed documentation syntax issues
</commit_message>
<xml_diff>
--- a/FinalProject/Document/final_project_212047542_327703013.docx
+++ b/FinalProject/Document/final_project_212047542_327703013.docx
@@ -376,23 +376,7 @@
           <w:sz w:val="24"/>
           <w:szCs w:val="24"/>
         </w:rPr>
-        <w:t xml:space="preserve">. Because the </w:t>
-      </w:r>
-      <w:proofErr w:type="spellStart"/>
-      <w:r>
-        <w:rPr>
-          <w:sz w:val="24"/>
-          <w:szCs w:val="24"/>
-        </w:rPr>
-        <w:t>thresholded</w:t>
-      </w:r>
-      <w:proofErr w:type="spellEnd"/>
-      <w:r>
-        <w:rPr>
-          <w:sz w:val="24"/>
-          <w:szCs w:val="24"/>
-        </w:rPr>
-        <w:t xml:space="preserve"> corner response consists of multi-pixel binary blobs rather than individual coordinates, we use connected component analysis to automatically compute each blob's center of mass (</w:t>
+        <w:t>. Because the thresholded corner response consists of multi-pixel binary blobs rather than individual coordinates, we use connected component analysis to automatically compute each blob's center of mass (</w:t>
       </w:r>
       <w:r>
         <w:rPr>
@@ -915,7 +899,7 @@
     </w:p>
     <w:p>
       <w:pPr>
-        <w:pStyle w:val="ListParagraph"/>
+        <w:pStyle w:val="a8"/>
         <w:numPr>
           <w:ilvl w:val="0"/>
           <w:numId w:val="10"/>
@@ -1383,7 +1367,7 @@
     </w:p>
     <w:p>
       <w:pPr>
-        <w:pStyle w:val="ListParagraph"/>
+        <w:pStyle w:val="a8"/>
         <w:numPr>
           <w:ilvl w:val="0"/>
           <w:numId w:val="12"/>
@@ -1502,7 +1486,7 @@
     </w:p>
     <w:p>
       <w:pPr>
-        <w:pStyle w:val="ListParagraph"/>
+        <w:pStyle w:val="a8"/>
         <w:numPr>
           <w:ilvl w:val="0"/>
           <w:numId w:val="12"/>
@@ -1638,7 +1622,7 @@
     </w:p>
     <w:p>
       <w:pPr>
-        <w:pStyle w:val="ListParagraph"/>
+        <w:pStyle w:val="a8"/>
         <w:numPr>
           <w:ilvl w:val="0"/>
           <w:numId w:val="12"/>
@@ -1662,20 +1646,8 @@
           <w:szCs w:val="24"/>
           <w:lang w:val="en-US"/>
         </w:rPr>
-        <w:t xml:space="preserve">Full Affine vs. Partial Affine vs. </w:t>
-      </w:r>
-      <w:proofErr w:type="spellStart"/>
-      <w:r>
-        <w:rPr>
-          <w:b/>
-          <w:bCs/>
-          <w:sz w:val="24"/>
-          <w:szCs w:val="24"/>
-          <w:lang w:val="en-US"/>
-        </w:rPr>
-        <w:t>Homography</w:t>
-      </w:r>
-      <w:proofErr w:type="spellEnd"/>
+        <w:t>Full Affine vs. Partial Affine vs. Homography</w:t>
+      </w:r>
       <w:r>
         <w:rPr>
           <w:b/>
@@ -1697,7 +1669,7 @@
     </w:p>
     <w:p>
       <w:pPr>
-        <w:pStyle w:val="ListParagraph"/>
+        <w:pStyle w:val="a8"/>
         <w:numPr>
           <w:ilvl w:val="1"/>
           <w:numId w:val="12"/>
@@ -1750,7 +1722,7 @@
     </w:p>
     <w:p>
       <w:pPr>
-        <w:pStyle w:val="ListParagraph"/>
+        <w:pStyle w:val="a8"/>
         <w:numPr>
           <w:ilvl w:val="1"/>
           <w:numId w:val="12"/>
@@ -1825,7 +1797,7 @@
     </w:p>
     <w:p>
       <w:pPr>
-        <w:pStyle w:val="ListParagraph"/>
+        <w:pStyle w:val="a8"/>
         <w:numPr>
           <w:ilvl w:val="1"/>
           <w:numId w:val="12"/>
@@ -1841,27 +1813,15 @@
           <w:lang w:val="en-US"/>
         </w:rPr>
       </w:pPr>
-      <w:proofErr w:type="spellStart"/>
-      <w:r>
-        <w:rPr>
-          <w:b/>
-          <w:bCs/>
-          <w:sz w:val="24"/>
-          <w:szCs w:val="24"/>
-          <w:lang w:val="en-US"/>
-        </w:rPr>
-        <w:t>Homography</w:t>
-      </w:r>
-      <w:proofErr w:type="spellEnd"/>
-      <w:r>
-        <w:rPr>
-          <w:b/>
-          <w:bCs/>
-          <w:sz w:val="24"/>
-          <w:szCs w:val="24"/>
-          <w:lang w:val="en-US"/>
-        </w:rPr>
-        <w:t xml:space="preserve"> (8 DOF / Projective):</w:t>
+      <w:r>
+        <w:rPr>
+          <w:b/>
+          <w:bCs/>
+          <w:sz w:val="24"/>
+          <w:szCs w:val="24"/>
+          <w:lang w:val="en-US"/>
+        </w:rPr>
+        <w:t>Homography (8 DOF / Projective):</w:t>
       </w:r>
       <w:r>
         <w:rPr>
@@ -1963,25 +1923,7 @@
           <w:szCs w:val="24"/>
           <w:lang w:val="en-US"/>
         </w:rPr>
-        <w:t xml:space="preserve">tilting, upgrading to a </w:t>
-      </w:r>
-      <w:proofErr w:type="spellStart"/>
-      <w:r>
-        <w:rPr>
-          <w:sz w:val="24"/>
-          <w:szCs w:val="24"/>
-          <w:lang w:val="en-US"/>
-        </w:rPr>
-        <w:t>Homography</w:t>
-      </w:r>
-      <w:proofErr w:type="spellEnd"/>
-      <w:r>
-        <w:rPr>
-          <w:sz w:val="24"/>
-          <w:szCs w:val="24"/>
-          <w:lang w:val="en-US"/>
-        </w:rPr>
-        <w:t xml:space="preserve"> model did not yield a visible change. The simpler Partial Affine model, with</w:t>
+        <w:t>tilting, upgrading to a Homography model did not yield a visible change. The simpler Partial Affine model, with</w:t>
       </w:r>
       <w:r>
         <w:rPr>
@@ -2105,23 +2047,7 @@
           <w:sz w:val="24"/>
           <w:szCs w:val="24"/>
         </w:rPr>
-        <w:t xml:space="preserve">The second stage receives the stabilized video from Stage 1 and separates the walking person from the static scene. In the course lectures, background subtraction was introduced as a per-pixel temporal decision problem: for each pixel location (x, y), we observe its intensity profile across time and decide whether the current observation belongs to the static background or to a dynamic foreground object. The simplest approach would be </w:t>
-      </w:r>
-      <w:proofErr w:type="gramStart"/>
-      <w:r>
-        <w:rPr>
-          <w:sz w:val="24"/>
-          <w:szCs w:val="24"/>
-        </w:rPr>
-        <w:t>frame</w:t>
-      </w:r>
-      <w:proofErr w:type="gramEnd"/>
-      <w:r>
-        <w:rPr>
-          <w:sz w:val="24"/>
-          <w:szCs w:val="24"/>
-        </w:rPr>
-        <w:t xml:space="preserve"> differencing, but that is too sensitive to noise and residual stabilization motion. Therefore, we used a Gaussian Mixture Model background model, implemented through OpenCV MOG2, and then added our own temporal consistency, component selection, and forward/backward mask fusion around it.</w:t>
+        <w:t>The second stage receives the stabilized video from Stage 1 and separates the walking person from the static scene. In the course lectures, background subtraction was introduced as a per-pixel temporal decision problem: for each pixel location (x, y), we observe its intensity profile across time and decide whether the current observation belongs to the static background or to a dynamic foreground object. The simplest approach would be frame differencing, but that is too sensitive to noise and residual stabilization motion. Therefore, we used a Gaussian Mixture Model background model, implemented through OpenCV MOG2, and then added our own temporal consistency, component selection, and forward/backward mask fusion around it.</w:t>
       </w:r>
     </w:p>
     <w:p>
@@ -2254,7 +2180,7 @@
     </w:p>
     <w:p>
       <w:pPr>
-        <w:pStyle w:val="ListParagraph"/>
+        <w:pStyle w:val="a8"/>
         <w:numPr>
           <w:ilvl w:val="0"/>
           <w:numId w:val="13"/>
@@ -2284,7 +2210,7 @@
     </w:p>
     <w:p>
       <w:pPr>
-        <w:pStyle w:val="ListParagraph"/>
+        <w:pStyle w:val="a8"/>
         <w:numPr>
           <w:ilvl w:val="0"/>
           <w:numId w:val="13"/>
@@ -2328,7 +2254,7 @@
     </w:p>
     <w:p>
       <w:pPr>
-        <w:pStyle w:val="ListParagraph"/>
+        <w:pStyle w:val="a8"/>
         <w:numPr>
           <w:ilvl w:val="0"/>
           <w:numId w:val="13"/>
@@ -2353,28 +2279,12 @@
           <w:sz w:val="24"/>
           <w:szCs w:val="24"/>
         </w:rPr>
-        <w:t xml:space="preserve"> the trained model is frozen using </w:t>
-      </w:r>
-      <w:proofErr w:type="spellStart"/>
-      <w:r>
-        <w:rPr>
-          <w:sz w:val="24"/>
-          <w:szCs w:val="24"/>
-        </w:rPr>
-        <w:t>learningRate</w:t>
-      </w:r>
-      <w:proofErr w:type="spellEnd"/>
-      <w:r>
-        <w:rPr>
-          <w:sz w:val="24"/>
-          <w:szCs w:val="24"/>
-        </w:rPr>
-        <w:t xml:space="preserve"> = 0.0. Each frame is classified into background, shadow, or foreground. Only true foreground pixels with value 255 are retained.</w:t>
+        <w:t xml:space="preserve"> the trained model is frozen using learningRate = 0.0. Each frame is classified into background, shadow, or foreground. Only true foreground pixels with value 255 are retained.</w:t>
       </w:r>
     </w:p>
     <w:p>
       <w:pPr>
-        <w:pStyle w:val="ListParagraph"/>
+        <w:pStyle w:val="a8"/>
         <w:numPr>
           <w:ilvl w:val="0"/>
           <w:numId w:val="13"/>
@@ -2404,7 +2314,7 @@
     </w:p>
     <w:p>
       <w:pPr>
-        <w:pStyle w:val="ListParagraph"/>
+        <w:pStyle w:val="a8"/>
         <w:numPr>
           <w:ilvl w:val="0"/>
           <w:numId w:val="13"/>
@@ -2436,7 +2346,7 @@
     </w:p>
     <w:p>
       <w:pPr>
-        <w:pStyle w:val="ListParagraph"/>
+        <w:pStyle w:val="a8"/>
         <w:numPr>
           <w:ilvl w:val="0"/>
           <w:numId w:val="13"/>
@@ -2467,7 +2377,7 @@
     </w:p>
     <w:p>
       <w:pPr>
-        <w:pStyle w:val="ListParagraph"/>
+        <w:pStyle w:val="a8"/>
         <w:numPr>
           <w:ilvl w:val="0"/>
           <w:numId w:val="13"/>
@@ -2528,23 +2438,7 @@
           <w:sz w:val="24"/>
           <w:szCs w:val="24"/>
         </w:rPr>
-        <w:t xml:space="preserve">We started with a direct MOG2 background subtractor. This produced </w:t>
-      </w:r>
-      <w:proofErr w:type="gramStart"/>
-      <w:r>
-        <w:rPr>
-          <w:sz w:val="24"/>
-          <w:szCs w:val="24"/>
-        </w:rPr>
-        <w:t>ghosting</w:t>
-      </w:r>
-      <w:proofErr w:type="gramEnd"/>
-      <w:r>
-        <w:rPr>
-          <w:sz w:val="24"/>
-          <w:szCs w:val="24"/>
-        </w:rPr>
-        <w:t xml:space="preserve"> and background leakage, especially near high-contrast posters and at the end of the sequence. The reason is that background subtraction is extremely sensitive to residual stabilization motion: a wall that moves by only a few pixels may be classified as foreground. In addition, if the person appears over the same background location for many frames, the background model can partially absorb the person or leave a ghost when the person moves away.</w:t>
+        <w:t>We started with a direct MOG2 background subtractor. This produced ghosting and background leakage, especially near high-contrast posters and at the end of the sequence. The reason is that background subtraction is extremely sensitive to residual stabilization motion: a wall that moves by only a few pixels may be classified as foreground. In addition, if the person appears over the same background location for many frames, the background model can partially absorb the person or leave a ghost when the person moves away.</w:t>
       </w:r>
     </w:p>
     <w:p>
@@ -2565,7 +2459,7 @@
     </w:p>
     <w:p>
       <w:pPr>
-        <w:pStyle w:val="ListParagraph"/>
+        <w:pStyle w:val="a8"/>
         <w:numPr>
           <w:ilvl w:val="0"/>
           <w:numId w:val="14"/>
@@ -2590,28 +2484,12 @@
           <w:sz w:val="24"/>
           <w:szCs w:val="24"/>
         </w:rPr>
-        <w:t xml:space="preserve"> Instead of applying MOG2 directly on BGR frames, frames are converted to HSV. HSV partially separates chromatic content from brightness and </w:t>
-      </w:r>
-      <w:proofErr w:type="gramStart"/>
-      <w:r>
-        <w:rPr>
-          <w:sz w:val="24"/>
-          <w:szCs w:val="24"/>
-        </w:rPr>
-        <w:t>produced</w:t>
-      </w:r>
-      <w:proofErr w:type="gramEnd"/>
-      <w:r>
-        <w:rPr>
-          <w:sz w:val="24"/>
-          <w:szCs w:val="24"/>
-        </w:rPr>
-        <w:t xml:space="preserve"> more stable masks under small illumination changes.</w:t>
+        <w:t xml:space="preserve"> Instead of applying MOG2 directly on BGR frames, frames are converted to HSV. HSV partially separates chromatic content from brightness and produced more stable masks under small illumination changes.</w:t>
       </w:r>
     </w:p>
     <w:p>
       <w:pPr>
-        <w:pStyle w:val="ListParagraph"/>
+        <w:pStyle w:val="a8"/>
         <w:numPr>
           <w:ilvl w:val="0"/>
           <w:numId w:val="14"/>
@@ -2672,7 +2550,7 @@
     </w:p>
     <w:p>
       <w:pPr>
-        <w:pStyle w:val="ListParagraph"/>
+        <w:pStyle w:val="a8"/>
         <w:numPr>
           <w:ilvl w:val="0"/>
           <w:numId w:val="14"/>
@@ -2702,7 +2580,7 @@
     </w:p>
     <w:p>
       <w:pPr>
-        <w:pStyle w:val="ListParagraph"/>
+        <w:pStyle w:val="a8"/>
         <w:numPr>
           <w:ilvl w:val="0"/>
           <w:numId w:val="14"/>
@@ -2732,7 +2610,7 @@
     </w:p>
     <w:p>
       <w:pPr>
-        <w:pStyle w:val="ListParagraph"/>
+        <w:pStyle w:val="a8"/>
         <w:numPr>
           <w:ilvl w:val="0"/>
           <w:numId w:val="14"/>
@@ -2762,7 +2640,7 @@
     </w:p>
     <w:p>
       <w:pPr>
-        <w:pStyle w:val="ListParagraph"/>
+        <w:pStyle w:val="a8"/>
         <w:numPr>
           <w:ilvl w:val="0"/>
           <w:numId w:val="14"/>
@@ -2804,39 +2682,7 @@
           <w:sz w:val="24"/>
           <w:szCs w:val="24"/>
         </w:rPr>
-        <w:t xml:space="preserve">Rejected alternatives: KNN background subtraction and </w:t>
-      </w:r>
-      <w:proofErr w:type="spellStart"/>
-      <w:r>
-        <w:rPr>
-          <w:sz w:val="24"/>
-          <w:szCs w:val="24"/>
-        </w:rPr>
-        <w:t>GrabCut</w:t>
-      </w:r>
-      <w:proofErr w:type="spellEnd"/>
-      <w:r>
-        <w:rPr>
-          <w:sz w:val="24"/>
-          <w:szCs w:val="24"/>
-        </w:rPr>
-        <w:t xml:space="preserve"> refinement were tested. KNN did not improve the final quality, and </w:t>
-      </w:r>
-      <w:proofErr w:type="spellStart"/>
-      <w:r>
-        <w:rPr>
-          <w:sz w:val="24"/>
-          <w:szCs w:val="24"/>
-        </w:rPr>
-        <w:t>GrabCut</w:t>
-      </w:r>
-      <w:proofErr w:type="spellEnd"/>
-      <w:r>
-        <w:rPr>
-          <w:sz w:val="24"/>
-          <w:szCs w:val="24"/>
-        </w:rPr>
-        <w:t xml:space="preserve"> increased runtime significantly without solving the main leakage problem. We therefore kept MOG2 with our custom temporal logic.</w:t>
+        <w:t>Rejected alternatives: KNN background subtraction and GrabCut refinement were tested. KNN did not improve the final quality, and GrabCut increased runtime significantly without solving the main leakage problem. We therefore kept MOG2 with our custom temporal logic.</w:t>
       </w:r>
     </w:p>
     <w:p>
@@ -2870,7 +2716,7 @@
     </w:p>
     <w:p>
       <w:pPr>
-        <w:pStyle w:val="ListParagraph"/>
+        <w:pStyle w:val="a8"/>
         <w:numPr>
           <w:ilvl w:val="0"/>
           <w:numId w:val="17"/>
@@ -2932,28 +2778,12 @@
           <w:sz w:val="24"/>
           <w:szCs w:val="24"/>
         </w:rPr>
-        <w:t xml:space="preserve">therwise, a new mode is </w:t>
-      </w:r>
-      <w:proofErr w:type="gramStart"/>
-      <w:r>
-        <w:rPr>
-          <w:sz w:val="24"/>
-          <w:szCs w:val="24"/>
-        </w:rPr>
-        <w:t>created</w:t>
-      </w:r>
-      <w:proofErr w:type="gramEnd"/>
-      <w:r>
-        <w:rPr>
-          <w:sz w:val="24"/>
-          <w:szCs w:val="24"/>
-        </w:rPr>
-        <w:t xml:space="preserve"> or an old weak mode is replaced. The library function only produces a raw foreground mask. </w:t>
+        <w:t xml:space="preserve">therwise, a new mode is created or an old weak mode is replaced. The library function only produces a raw foreground mask. </w:t>
       </w:r>
     </w:p>
     <w:p>
       <w:pPr>
-        <w:pStyle w:val="ListParagraph"/>
+        <w:pStyle w:val="a8"/>
         <w:numPr>
           <w:ilvl w:val="0"/>
           <w:numId w:val="17"/>
@@ -3080,7 +2910,7 @@
     </w:p>
     <w:p>
       <w:pPr>
-        <w:pStyle w:val="ListParagraph"/>
+        <w:pStyle w:val="a8"/>
         <w:numPr>
           <w:ilvl w:val="0"/>
           <w:numId w:val="17"/>
@@ -3144,23 +2974,7 @@
           <w:sz w:val="24"/>
           <w:szCs w:val="24"/>
         </w:rPr>
-        <w:t xml:space="preserve"> </w:t>
-      </w:r>
-      <w:proofErr w:type="gramStart"/>
-      <w:r>
-        <w:rPr>
-          <w:sz w:val="24"/>
-          <w:szCs w:val="24"/>
-        </w:rPr>
-        <w:t>returns</w:t>
-      </w:r>
-      <w:proofErr w:type="gramEnd"/>
-      <w:r>
-        <w:rPr>
-          <w:sz w:val="24"/>
-          <w:szCs w:val="24"/>
-        </w:rPr>
-        <w:t xml:space="preserve"> a two-level hierarchy: external object boundaries and internal holes. We use this hierarchy in </w:t>
+        <w:t xml:space="preserve"> returns a two-level hierarchy: external object boundaries and internal holes. We use this hierarchy in </w:t>
       </w:r>
       <w:r>
         <w:rPr>
@@ -3169,9 +2983,15 @@
           <w:sz w:val="24"/>
           <w:szCs w:val="24"/>
         </w:rPr>
-        <w:t>_</w:t>
-      </w:r>
-      <w:proofErr w:type="spellStart"/>
+        <w:t>_fill_holes</w:t>
+      </w:r>
+      <w:r>
+        <w:rPr>
+          <w:sz w:val="24"/>
+          <w:szCs w:val="24"/>
+        </w:rPr>
+        <w:t xml:space="preserve">: if a contour has a parent, it is an internal hole, and we draw it in white. </w:t>
+      </w:r>
       <w:r>
         <w:rPr>
           <w:i/>
@@ -3179,15 +2999,14 @@
           <w:sz w:val="24"/>
           <w:szCs w:val="24"/>
         </w:rPr>
-        <w:t>fill_holes</w:t>
-      </w:r>
-      <w:proofErr w:type="spellEnd"/>
-      <w:r>
-        <w:rPr>
-          <w:sz w:val="24"/>
-          <w:szCs w:val="24"/>
-        </w:rPr>
-        <w:t xml:space="preserve">: if a contour has a parent, it is an internal hole, and we draw it in white. </w:t>
+        <w:t>RETR_EXTERNAL</w:t>
+      </w:r>
+      <w:r>
+        <w:rPr>
+          <w:sz w:val="24"/>
+          <w:szCs w:val="24"/>
+        </w:rPr>
+        <w:t xml:space="preserve"> is used later in </w:t>
       </w:r>
       <w:r>
         <w:rPr>
@@ -3196,22 +3015,6 @@
           <w:sz w:val="24"/>
           <w:szCs w:val="24"/>
         </w:rPr>
-        <w:t>RETR_EXTERNAL</w:t>
-      </w:r>
-      <w:r>
-        <w:rPr>
-          <w:sz w:val="24"/>
-          <w:szCs w:val="24"/>
-        </w:rPr>
-        <w:t xml:space="preserve"> is used later in </w:t>
-      </w:r>
-      <w:r>
-        <w:rPr>
-          <w:i/>
-          <w:iCs/>
-          <w:sz w:val="24"/>
-          <w:szCs w:val="24"/>
-        </w:rPr>
         <w:t>_solidify</w:t>
       </w:r>
       <w:r>
@@ -3238,7 +3041,7 @@
     </w:p>
     <w:p>
       <w:pPr>
-        <w:pStyle w:val="ListParagraph"/>
+        <w:pStyle w:val="a8"/>
         <w:numPr>
           <w:ilvl w:val="0"/>
           <w:numId w:val="17"/>
@@ -3326,14 +3129,22 @@
               <w:sz w:val="24"/>
               <w:szCs w:val="24"/>
             </w:rPr>
-            <m:t>score=area+70 · height-450·distance-25000 ·Δheight-12000· width</m:t>
+            <m:t xml:space="preserve">score=area+70 · </m:t>
+          </m:r>
+          <m:r>
+            <w:rPr>
+              <w:rFonts w:ascii="Cambria Math" w:hAnsi="Cambria Math"/>
+              <w:sz w:val="24"/>
+              <w:szCs w:val="24"/>
+            </w:rPr>
+            <m:t>height-450·distance-25000 ·Δheight-12000· width</m:t>
           </m:r>
         </m:oMath>
       </m:oMathPara>
     </w:p>
     <w:p>
       <w:pPr>
-        <w:pStyle w:val="ListParagraph"/>
+        <w:pStyle w:val="a8"/>
         <w:numPr>
           <w:ilvl w:val="0"/>
           <w:numId w:val="17"/>
@@ -3378,7 +3189,7 @@
     </w:p>
     <w:p>
       <w:pPr>
-        <w:pStyle w:val="ListParagraph"/>
+        <w:pStyle w:val="a8"/>
         <w:numPr>
           <w:ilvl w:val="0"/>
           <w:numId w:val="17"/>
@@ -3492,31 +3303,7 @@
           <w:szCs w:val="28"/>
         </w:rPr>
         <w:lastRenderedPageBreak/>
-        <w:t xml:space="preserve">Stage </w:t>
-      </w:r>
-      <w:r>
-        <w:rPr>
-          <w:b/>
-          <w:sz w:val="28"/>
-          <w:szCs w:val="28"/>
-        </w:rPr>
-        <w:t>3</w:t>
-      </w:r>
-      <w:r>
-        <w:rPr>
-          <w:b/>
-          <w:sz w:val="28"/>
-          <w:szCs w:val="28"/>
-        </w:rPr>
-        <w:t xml:space="preserve">: </w:t>
-      </w:r>
-      <w:r>
-        <w:rPr>
-          <w:b/>
-          <w:sz w:val="28"/>
-          <w:szCs w:val="28"/>
-        </w:rPr>
-        <w:t>Video Matting</w:t>
+        <w:t>Stage 3: Video Matting</w:t>
       </w:r>
     </w:p>
     <w:p>
@@ -3552,21 +3339,7 @@
         <w:rPr>
           <w:rFonts w:asciiTheme="minorHAnsi" w:hAnsiTheme="minorHAnsi" w:cs="Arial"/>
         </w:rPr>
-        <w:t xml:space="preserve">The </w:t>
-      </w:r>
-      <w:proofErr w:type="gramStart"/>
-      <w:r>
-        <w:rPr>
-          <w:rFonts w:asciiTheme="minorHAnsi" w:hAnsiTheme="minorHAnsi" w:cs="Arial"/>
-        </w:rPr>
-        <w:t>matting</w:t>
-      </w:r>
-      <w:proofErr w:type="gramEnd"/>
-      <w:r>
-        <w:rPr>
-          <w:rFonts w:asciiTheme="minorHAnsi" w:hAnsiTheme="minorHAnsi" w:cs="Arial"/>
-        </w:rPr>
-        <w:t xml:space="preserve"> module acts as the compositing engine of the project, taking the extracted color foreground from Stage 2 and seamlessly blending them onto a new static background image. Instead of using a harsh binary cut, the pipeline generates a continuous alpha matte </w:t>
+        <w:t xml:space="preserve">The matting module acts as the compositing engine of the project, taking the extracted color foreground from Stage 2 and seamlessly blending them onto a new static background image. Instead of using a harsh binary cut, the pipeline generates a continuous alpha matte </w:t>
       </w:r>
       <m:oMath>
         <m:r>
@@ -4259,7 +4032,7 @@
     </w:p>
     <w:p>
       <w:pPr>
-        <w:pStyle w:val="ListParagraph"/>
+        <w:pStyle w:val="a8"/>
         <w:numPr>
           <w:ilvl w:val="0"/>
           <w:numId w:val="20"/>
@@ -4304,36 +4077,24 @@
           <w:sz w:val="24"/>
           <w:szCs w:val="24"/>
         </w:rPr>
-        <w:t>Instead of relying on standard morphology (like dilation or erosion, cv2.distanceTransform measures accurate distances. By calculating the ratio of the internal distance (</w:t>
-      </w:r>
-      <w:proofErr w:type="spellStart"/>
-      <w:r>
-        <w:rPr>
-          <w:bCs/>
-          <w:sz w:val="24"/>
-          <w:szCs w:val="24"/>
-        </w:rPr>
-        <w:t>dist_in</w:t>
-      </w:r>
-      <w:proofErr w:type="spellEnd"/>
-      <w:r>
-        <w:rPr>
-          <w:bCs/>
-          <w:sz w:val="24"/>
-          <w:szCs w:val="24"/>
-        </w:rPr>
-        <w:t>) to the total distance boundary field (</w:t>
-      </w:r>
-      <w:proofErr w:type="spellStart"/>
-      <w:r>
-        <w:rPr>
-          <w:bCs/>
-          <w:sz w:val="24"/>
-          <w:szCs w:val="24"/>
-        </w:rPr>
-        <w:t>dist_in</w:t>
-      </w:r>
-      <w:proofErr w:type="spellEnd"/>
+        <w:t>Instead of relying on standard morphology (like dilation or erosion</w:t>
+      </w:r>
+      <w:r>
+        <w:rPr>
+          <w:bCs/>
+          <w:sz w:val="24"/>
+          <w:szCs w:val="24"/>
+        </w:rPr>
+        <w:t>)</w:t>
+      </w:r>
+      <w:r>
+        <w:rPr>
+          <w:bCs/>
+          <w:sz w:val="24"/>
+          <w:szCs w:val="24"/>
+        </w:rPr>
+        <w:t>, cv2.distanceTransform measures accurate distances. By calculating the ratio of the internal distance (dist_in) to the total distance boundary field (dist_in</w:t>
+      </w:r>
       <w:r>
         <w:rPr>
           <w:bCs/>
@@ -4358,28 +4119,18 @@
         </w:rPr>
         <w:t xml:space="preserve"> </w:t>
       </w:r>
-      <w:proofErr w:type="spellStart"/>
-      <w:r>
-        <w:rPr>
-          <w:bCs/>
-          <w:sz w:val="24"/>
-          <w:szCs w:val="24"/>
-        </w:rPr>
-        <w:t>dist_out</w:t>
-      </w:r>
-      <w:proofErr w:type="spellEnd"/>
-      <w:r>
-        <w:rPr>
-          <w:bCs/>
-          <w:sz w:val="24"/>
-          <w:szCs w:val="24"/>
-        </w:rPr>
-        <w:t>), the pipeline maps a smooth, gradual gradient right across the contour edges. The 10^(-6) epsilon value prevents division-by-zero errors in fully static background regions.</w:t>
+      <w:r>
+        <w:rPr>
+          <w:bCs/>
+          <w:sz w:val="24"/>
+          <w:szCs w:val="24"/>
+        </w:rPr>
+        <w:t>dist_out), the pipeline maps a smooth, gradual gradient right across the contour edges. The 10^(-6) epsilon value prevents division-by-zero errors in fully static background regions.</w:t>
       </w:r>
     </w:p>
     <w:p>
       <w:pPr>
-        <w:pStyle w:val="ListParagraph"/>
+        <w:pStyle w:val="a8"/>
         <w:numPr>
           <w:ilvl w:val="0"/>
           <w:numId w:val="20"/>
@@ -4458,7 +4209,7 @@
     </w:p>
     <w:p>
       <w:pPr>
-        <w:pStyle w:val="ListParagraph"/>
+        <w:pStyle w:val="a8"/>
         <w:spacing w:after="120"/>
         <w:rPr>
           <w:b/>
@@ -4809,6 +4560,9 @@
             </m:sup>
           </m:sSup>
           <m:r>
+            <m:rPr>
+              <m:sty m:val="p"/>
+            </m:rPr>
             <w:rPr>
               <w:rFonts w:asciiTheme="minorHAnsi" w:hAnsiTheme="minorHAnsi"/>
             </w:rPr>
@@ -5071,21 +4825,7 @@
         <w:rPr>
           <w:rFonts w:asciiTheme="minorHAnsi" w:hAnsiTheme="minorHAnsi" w:cs="Arial"/>
         </w:rPr>
-        <w:t xml:space="preserve">The algorithm processes </w:t>
-      </w:r>
-      <w:proofErr w:type="gramStart"/>
-      <w:r>
-        <w:rPr>
-          <w:rFonts w:asciiTheme="minorHAnsi" w:hAnsiTheme="minorHAnsi" w:cs="Arial"/>
-        </w:rPr>
-        <w:t>frames</w:t>
-      </w:r>
-      <w:proofErr w:type="gramEnd"/>
-      <w:r>
-        <w:rPr>
-          <w:rFonts w:asciiTheme="minorHAnsi" w:hAnsiTheme="minorHAnsi" w:cs="Arial"/>
-        </w:rPr>
-        <w:t xml:space="preserve"> sequentially through a Prediction-Correction-Resampling loop:</w:t>
+        <w:t>The algorithm processes frames sequentially through a Prediction-Correction-Resampling loop:</w:t>
       </w:r>
     </w:p>
     <w:p>
@@ -5131,7 +4871,7 @@
     </w:p>
     <w:p>
       <w:pPr>
-        <w:pStyle w:val="ListParagraph"/>
+        <w:pStyle w:val="a8"/>
         <w:spacing w:afterAutospacing="1"/>
         <w:ind w:left="1440"/>
         <w:rPr>
@@ -5664,7 +5404,7 @@
     </w:p>
     <w:p>
       <w:pPr>
-        <w:pStyle w:val="ListParagraph"/>
+        <w:pStyle w:val="a8"/>
         <w:spacing w:afterAutospacing="1"/>
         <w:ind w:left="1440"/>
         <w:rPr>
@@ -5873,7 +5613,6 @@
         </w:rPr>
         <w:t xml:space="preserve"> sampled from the current set based on their importance weights using a uniform distribution look-up inversion (</w:t>
       </w:r>
-      <w:proofErr w:type="spellStart"/>
       <w:r>
         <w:rPr>
           <w:rStyle w:val="HTMLCode"/>
@@ -5883,7 +5622,6 @@
         </w:rPr>
         <w:t>np.searchsorted</w:t>
       </w:r>
-      <w:proofErr w:type="spellEnd"/>
       <w:r>
         <w:rPr>
           <w:rFonts w:asciiTheme="minorHAnsi" w:hAnsiTheme="minorHAnsi" w:cs="Arial"/>
@@ -5973,31 +5711,19 @@
         <w:rPr>
           <w:rFonts w:asciiTheme="minorHAnsi" w:hAnsiTheme="minorHAnsi" w:cs="Arial"/>
         </w:rPr>
-        <w:t xml:space="preserve">: Calculating 400 separate 3D color histograms per frame on a full-sized video </w:t>
+        <w:t xml:space="preserve">: Calculating 400 separate 3D color histograms per frame on a full-sized video is </w:t>
       </w:r>
       <w:r>
         <w:rPr>
           <w:rFonts w:asciiTheme="minorHAnsi" w:hAnsiTheme="minorHAnsi" w:cs="Arial"/>
         </w:rPr>
-        <w:t xml:space="preserve">is </w:t>
+        <w:t>quite</w:t>
       </w:r>
       <w:r>
         <w:rPr>
           <w:rFonts w:asciiTheme="minorHAnsi" w:hAnsiTheme="minorHAnsi" w:cs="Arial"/>
         </w:rPr>
-        <w:t>quite</w:t>
-      </w:r>
-      <w:r>
-        <w:rPr>
-          <w:rFonts w:asciiTheme="minorHAnsi" w:hAnsiTheme="minorHAnsi" w:cs="Arial"/>
-        </w:rPr>
-        <w:t xml:space="preserve"> slow</w:t>
-      </w:r>
-      <w:r>
-        <w:rPr>
-          <w:rFonts w:asciiTheme="minorHAnsi" w:hAnsiTheme="minorHAnsi" w:cs="Arial"/>
-        </w:rPr>
-        <w:t xml:space="preserve">. We resolved this </w:t>
+        <w:t xml:space="preserve"> slow. We resolved this </w:t>
       </w:r>
       <w:r>
         <w:rPr>
@@ -6299,43 +6025,19 @@
         <w:rPr>
           <w:rFonts w:asciiTheme="minorHAnsi" w:hAnsiTheme="minorHAnsi" w:cs="Arial"/>
         </w:rPr>
-        <w:t xml:space="preserve"> box (the sizes of the person) it sometimes would ended in a local minima, so by shrinking the size of the </w:t>
+        <w:t xml:space="preserve"> box (the sizes of the person) it sometimes would ended in a local minima, so by shrinking the size of the bounding box we got consistence results that avoid local minima, we calculate the difference</w:t>
       </w:r>
       <w:r>
         <w:rPr>
           <w:rFonts w:asciiTheme="minorHAnsi" w:hAnsiTheme="minorHAnsi" w:cs="Arial"/>
         </w:rPr>
-        <w:t xml:space="preserve">bounding </w:t>
+        <w:t>s</w:t>
       </w:r>
       <w:r>
         <w:rPr>
           <w:rFonts w:asciiTheme="minorHAnsi" w:hAnsiTheme="minorHAnsi" w:cs="Arial"/>
         </w:rPr>
-        <w:t>box we got consistence results that avoid local minima, we calculate the difference</w:t>
-      </w:r>
-      <w:r>
-        <w:rPr>
-          <w:rFonts w:asciiTheme="minorHAnsi" w:hAnsiTheme="minorHAnsi" w:cs="Arial"/>
-        </w:rPr>
-        <w:t>s</w:t>
-      </w:r>
-      <w:r>
-        <w:rPr>
-          <w:rFonts w:asciiTheme="minorHAnsi" w:hAnsiTheme="minorHAnsi" w:cs="Arial"/>
-        </w:rPr>
-        <w:t xml:space="preserve"> and add it when we plotting the </w:t>
-      </w:r>
-      <w:r>
-        <w:rPr>
-          <w:rFonts w:asciiTheme="minorHAnsi" w:hAnsiTheme="minorHAnsi" w:cs="Arial"/>
-        </w:rPr>
-        <w:t>bounding box</w:t>
-      </w:r>
-      <w:r>
-        <w:rPr>
-          <w:rFonts w:asciiTheme="minorHAnsi" w:hAnsiTheme="minorHAnsi" w:cs="Arial"/>
-        </w:rPr>
-        <w:t>.</w:t>
+        <w:t xml:space="preserve"> and add it when we plotting the bounding box.</w:t>
       </w:r>
     </w:p>
     <w:p>
@@ -6375,7 +6077,7 @@
     </w:p>
     <w:p>
       <w:pPr>
-        <w:pStyle w:val="ListParagraph"/>
+        <w:pStyle w:val="a8"/>
         <w:numPr>
           <w:ilvl w:val="0"/>
           <w:numId w:val="26"/>
@@ -6384,7 +6086,7 @@
           <w:rFonts w:asciiTheme="minorHAnsi" w:eastAsia="Times New Roman" w:hAnsiTheme="minorHAnsi" w:cs="Times New Roman"/>
           <w:sz w:val="24"/>
           <w:szCs w:val="24"/>
-          <w:lang w:val="en-IL" w:eastAsia="en-IL"/>
+          <w:lang/>
         </w:rPr>
       </w:pPr>
       <w:r>
@@ -6422,27 +6124,7 @@
           <w:sz w:val="24"/>
           <w:szCs w:val="24"/>
         </w:rPr>
-        <w:t xml:space="preserve">To evaluate how closely a candidate particle matches the target subject, the tracking module extracts a multi-dimensional color fingerprint using cv2.calcHist. The pipeline constructs a 3D Color Histogram across the </w:t>
-      </w:r>
-      <w:proofErr w:type="gramStart"/>
-      <w:r>
-        <w:rPr>
-          <w:rFonts w:asciiTheme="minorHAnsi" w:hAnsiTheme="minorHAnsi"/>
-          <w:bCs/>
-          <w:sz w:val="24"/>
-          <w:szCs w:val="24"/>
-        </w:rPr>
-        <w:t>three color</w:t>
-      </w:r>
-      <w:proofErr w:type="gramEnd"/>
-      <w:r>
-        <w:rPr>
-          <w:rFonts w:asciiTheme="minorHAnsi" w:hAnsiTheme="minorHAnsi"/>
-          <w:bCs/>
-          <w:sz w:val="24"/>
-          <w:szCs w:val="24"/>
-        </w:rPr>
-        <w:t xml:space="preserve"> channels simultaneously, quantizing the dense BGR color space into a manageable </w:t>
+        <w:t xml:space="preserve">To evaluate how closely a candidate particle matches the target subject, the tracking module extracts a multi-dimensional color fingerprint using cv2.calcHist. The pipeline constructs a 3D Color Histogram across the three color channels simultaneously, quantizing the dense BGR color space into a manageable </w:t>
       </w:r>
       <m:oMath>
         <m:r>
@@ -6466,7 +6148,7 @@
     </w:p>
     <w:p>
       <w:pPr>
-        <w:pStyle w:val="ListParagraph"/>
+        <w:pStyle w:val="a8"/>
         <w:numPr>
           <w:ilvl w:val="0"/>
           <w:numId w:val="26"/>
@@ -6475,7 +6157,7 @@
           <w:rFonts w:asciiTheme="minorHAnsi" w:eastAsia="Times New Roman" w:hAnsiTheme="minorHAnsi" w:cs="Times New Roman"/>
           <w:sz w:val="24"/>
           <w:szCs w:val="24"/>
-          <w:lang w:val="en-IL" w:eastAsia="en-IL"/>
+          <w:lang/>
         </w:rPr>
       </w:pPr>
       <w:r>
@@ -6485,28 +6167,17 @@
           <w:bCs/>
           <w:sz w:val="24"/>
           <w:szCs w:val="24"/>
-          <w:lang w:val="en-IL" w:eastAsia="en-IL"/>
+          <w:lang/>
         </w:rPr>
         <w:lastRenderedPageBreak/>
-        <w:t>CDF Resampling via Binary Search</w:t>
+        <w:t xml:space="preserve">CDF Resampling via Binary Search: </w:t>
       </w:r>
       <w:r>
         <w:rPr>
           <w:rFonts w:asciiTheme="minorHAnsi" w:eastAsia="Times New Roman" w:hAnsiTheme="minorHAnsi" w:cs="Times New Roman"/>
-          <w:b/>
-          <w:bCs/>
-          <w:sz w:val="24"/>
-          <w:szCs w:val="24"/>
-          <w:lang w:val="en-IL" w:eastAsia="en-IL"/>
-        </w:rPr>
-        <w:t xml:space="preserve">: </w:t>
-      </w:r>
-      <w:r>
-        <w:rPr>
-          <w:rFonts w:asciiTheme="minorHAnsi" w:eastAsia="Times New Roman" w:hAnsiTheme="minorHAnsi" w:cs="Times New Roman"/>
-          <w:sz w:val="24"/>
-          <w:szCs w:val="24"/>
-          <w:lang w:val="en-IL" w:eastAsia="en-IL"/>
+          <w:sz w:val="24"/>
+          <w:szCs w:val="24"/>
+          <w:lang/>
         </w:rPr>
         <w:t xml:space="preserve">To replace poorly positioned particles with high-weight successes without introducing an </w:t>
       </w:r>
@@ -6516,7 +6187,7 @@
             <w:rFonts w:ascii="Cambria Math" w:eastAsia="Times New Roman" w:hAnsi="Cambria Math" w:cs="Arial"/>
             <w:sz w:val="24"/>
             <w:szCs w:val="24"/>
-            <w:lang w:val="en-IL" w:eastAsia="en-IL"/>
+            <w:lang/>
           </w:rPr>
           <m:t>O</m:t>
         </m:r>
@@ -6527,7 +6198,7 @@
                 <w:rFonts w:ascii="Cambria Math" w:eastAsia="Times New Roman" w:hAnsi="Cambria Math" w:cs="Arial"/>
                 <w:sz w:val="24"/>
                 <w:szCs w:val="24"/>
-                <w:lang w:val="en-IL" w:eastAsia="en-IL"/>
+                <w:lang/>
               </w:rPr>
             </m:ctrlPr>
           </m:dPr>
@@ -6539,7 +6210,7 @@
                     <w:rFonts w:ascii="Cambria Math" w:eastAsia="Times New Roman" w:hAnsi="Cambria Math" w:cs="Arial"/>
                     <w:sz w:val="24"/>
                     <w:szCs w:val="24"/>
-                    <w:lang w:val="en-IL" w:eastAsia="en-IL"/>
+                    <w:lang/>
                   </w:rPr>
                 </m:ctrlPr>
               </m:sSupPr>
@@ -6549,7 +6220,7 @@
                     <w:rFonts w:ascii="Cambria Math" w:eastAsia="Times New Roman" w:hAnsi="Cambria Math" w:cs="Arial"/>
                     <w:sz w:val="24"/>
                     <w:szCs w:val="24"/>
-                    <w:lang w:val="en-IL" w:eastAsia="en-IL"/>
+                    <w:lang/>
                   </w:rPr>
                   <m:t>N</m:t>
                 </m:r>
@@ -6560,7 +6231,7 @@
                     <w:rFonts w:ascii="Cambria Math" w:eastAsia="Times New Roman" w:hAnsi="Cambria Math" w:cs="Arial"/>
                     <w:sz w:val="24"/>
                     <w:szCs w:val="24"/>
-                    <w:lang w:val="en-IL" w:eastAsia="en-IL"/>
+                    <w:lang/>
                   </w:rPr>
                   <m:t>2</m:t>
                 </m:r>
@@ -6574,7 +6245,7 @@
           <w:rFonts w:asciiTheme="minorHAnsi" w:eastAsia="Times New Roman" w:hAnsiTheme="minorHAnsi" w:cs="Times New Roman"/>
           <w:sz w:val="24"/>
           <w:szCs w:val="24"/>
-          <w:lang w:val="en-IL" w:eastAsia="en-IL"/>
+          <w:lang/>
         </w:rPr>
         <w:t xml:space="preserve"> algorithmic slowdown, we map the normalized weights to a cumulative sum array (CDF). Generating </w:t>
       </w:r>
@@ -6584,7 +6255,7 @@
             <w:rFonts w:ascii="Cambria Math" w:eastAsia="Times New Roman" w:hAnsi="Cambria Math" w:cs="Arial"/>
             <w:sz w:val="24"/>
             <w:szCs w:val="24"/>
-            <w:lang w:val="en-IL" w:eastAsia="en-IL"/>
+            <w:lang/>
           </w:rPr>
           <m:t>N</m:t>
         </m:r>
@@ -6594,29 +6265,25 @@
           <w:rFonts w:asciiTheme="minorHAnsi" w:eastAsia="Times New Roman" w:hAnsiTheme="minorHAnsi" w:cs="Times New Roman"/>
           <w:sz w:val="24"/>
           <w:szCs w:val="24"/>
-          <w:lang w:val="en-IL" w:eastAsia="en-IL"/>
+          <w:lang/>
         </w:rPr>
         <w:t xml:space="preserve"> random uniform numbers and utilizing </w:t>
       </w:r>
-      <w:proofErr w:type="spellStart"/>
-      <w:proofErr w:type="gramStart"/>
       <w:r>
         <w:rPr>
           <w:rFonts w:asciiTheme="minorHAnsi" w:eastAsia="Times New Roman" w:hAnsiTheme="minorHAnsi" w:cs="Arial"/>
           <w:sz w:val="24"/>
           <w:szCs w:val="24"/>
-          <w:lang w:val="en-IL" w:eastAsia="en-IL"/>
+          <w:lang/>
         </w:rPr>
         <w:t>np.searchsorted</w:t>
       </w:r>
-      <w:proofErr w:type="spellEnd"/>
-      <w:proofErr w:type="gramEnd"/>
       <w:r>
         <w:rPr>
           <w:rFonts w:asciiTheme="minorHAnsi" w:eastAsia="Times New Roman" w:hAnsiTheme="minorHAnsi" w:cs="Times New Roman"/>
           <w:sz w:val="24"/>
           <w:szCs w:val="24"/>
-          <w:lang w:val="en-IL" w:eastAsia="en-IL"/>
+          <w:lang/>
         </w:rPr>
         <w:t xml:space="preserve"> allows us to perform a binary search index lookup. This handles the entire resampling phase in </w:t>
       </w:r>
@@ -6626,7 +6293,7 @@
             <w:rFonts w:ascii="Cambria Math" w:eastAsia="Times New Roman" w:hAnsi="Cambria Math" w:cs="Arial"/>
             <w:sz w:val="24"/>
             <w:szCs w:val="24"/>
-            <w:lang w:val="en-IL" w:eastAsia="en-IL"/>
+            <w:lang/>
           </w:rPr>
           <m:t>O</m:t>
         </m:r>
@@ -6637,7 +6304,7 @@
                 <w:rFonts w:ascii="Cambria Math" w:eastAsia="Times New Roman" w:hAnsi="Cambria Math" w:cs="Arial"/>
                 <w:sz w:val="24"/>
                 <w:szCs w:val="24"/>
-                <w:lang w:val="en-IL" w:eastAsia="en-IL"/>
+                <w:lang/>
               </w:rPr>
             </m:ctrlPr>
           </m:dPr>
@@ -6647,7 +6314,7 @@
                 <w:rFonts w:ascii="Cambria Math" w:eastAsia="Times New Roman" w:hAnsi="Cambria Math" w:cs="Arial"/>
                 <w:sz w:val="24"/>
                 <w:szCs w:val="24"/>
-                <w:lang w:val="en-IL" w:eastAsia="en-IL"/>
+                <w:lang/>
               </w:rPr>
               <m:t>N</m:t>
             </m:r>
@@ -6658,7 +6325,7 @@
                     <w:rFonts w:ascii="Cambria Math" w:eastAsia="Times New Roman" w:hAnsi="Cambria Math" w:cs="Arial"/>
                     <w:sz w:val="24"/>
                     <w:szCs w:val="24"/>
-                    <w:lang w:val="en-IL" w:eastAsia="en-IL"/>
+                    <w:lang/>
                   </w:rPr>
                 </m:ctrlPr>
               </m:funcPr>
@@ -6671,7 +6338,7 @@
                     <w:rFonts w:ascii="Cambria Math" w:eastAsia="Times New Roman" w:hAnsi="Cambria Math" w:cs="Arial"/>
                     <w:sz w:val="24"/>
                     <w:szCs w:val="24"/>
-                    <w:lang w:val="en-IL" w:eastAsia="en-IL"/>
+                    <w:lang/>
                   </w:rPr>
                   <m:t>log</m:t>
                 </m:r>
@@ -6682,7 +6349,7 @@
                     <w:rFonts w:ascii="Cambria Math" w:eastAsia="Times New Roman" w:hAnsi="Cambria Math" w:cs="Arial"/>
                     <w:sz w:val="24"/>
                     <w:szCs w:val="24"/>
-                    <w:lang w:val="en-IL" w:eastAsia="en-IL"/>
+                    <w:lang/>
                   </w:rPr>
                   <m:t>N</m:t>
                 </m:r>
@@ -6696,14 +6363,14 @@
           <w:rFonts w:asciiTheme="minorHAnsi" w:eastAsia="Times New Roman" w:hAnsiTheme="minorHAnsi" w:cs="Times New Roman"/>
           <w:sz w:val="24"/>
           <w:szCs w:val="24"/>
-          <w:lang w:val="en-IL" w:eastAsia="en-IL"/>
+          <w:lang/>
         </w:rPr>
         <w:t xml:space="preserve"> time, ensuring highly efficient state tracking across long video files.</w:t>
       </w:r>
     </w:p>
     <w:p>
       <w:pPr>
-        <w:pStyle w:val="ListParagraph"/>
+        <w:pStyle w:val="a8"/>
         <w:numPr>
           <w:ilvl w:val="0"/>
           <w:numId w:val="26"/>
@@ -6712,7 +6379,7 @@
           <w:rFonts w:asciiTheme="minorHAnsi" w:eastAsia="Times New Roman" w:hAnsiTheme="minorHAnsi" w:cs="Times New Roman"/>
           <w:sz w:val="24"/>
           <w:szCs w:val="24"/>
-          <w:lang w:val="en-IL" w:eastAsia="en-IL"/>
+          <w:lang/>
         </w:rPr>
       </w:pPr>
       <w:r>
@@ -6722,7 +6389,7 @@
           <w:bCs/>
           <w:sz w:val="24"/>
           <w:szCs w:val="24"/>
-          <w:lang w:val="en-IL" w:eastAsia="en-IL"/>
+          <w:lang/>
         </w:rPr>
         <w:t>Bhattacharyya Distance:</w:t>
       </w:r>
@@ -6733,7 +6400,7 @@
           <w:bCs/>
           <w:sz w:val="24"/>
           <w:szCs w:val="24"/>
-          <w:lang w:val="en-IL" w:eastAsia="en-IL"/>
+          <w:lang/>
         </w:rPr>
         <w:t xml:space="preserve"> </w:t>
       </w:r>
@@ -6742,7 +6409,7 @@
           <w:rFonts w:asciiTheme="minorHAnsi" w:eastAsia="Times New Roman" w:hAnsiTheme="minorHAnsi" w:cs="Times New Roman"/>
           <w:sz w:val="24"/>
           <w:szCs w:val="24"/>
-          <w:lang w:val="en-IL" w:eastAsia="en-IL"/>
+          <w:lang/>
         </w:rPr>
         <w:t xml:space="preserve">The Bhattacharyya coefficient </w:t>
       </w:r>
@@ -6752,7 +6419,7 @@
             <w:rFonts w:ascii="Cambria Math" w:eastAsia="Times New Roman" w:hAnsi="Cambria Math" w:cs="Arial"/>
             <w:sz w:val="24"/>
             <w:szCs w:val="24"/>
-            <w:lang w:val="en-IL" w:eastAsia="en-IL"/>
+            <w:lang/>
           </w:rPr>
           <m:t>ρ</m:t>
         </m:r>
@@ -6762,7 +6429,7 @@
           <w:rFonts w:asciiTheme="minorHAnsi" w:eastAsia="Times New Roman" w:hAnsiTheme="minorHAnsi" w:cs="Times New Roman"/>
           <w:sz w:val="24"/>
           <w:szCs w:val="24"/>
-          <w:lang w:val="en-IL" w:eastAsia="en-IL"/>
+          <w:lang/>
         </w:rPr>
         <w:t xml:space="preserve"> outputs a value between </w:t>
       </w:r>
@@ -6772,7 +6439,7 @@
             <w:rFonts w:ascii="Cambria Math" w:eastAsia="Times New Roman" w:hAnsi="Cambria Math" w:cs="Arial"/>
             <w:sz w:val="24"/>
             <w:szCs w:val="24"/>
-            <w:lang w:val="en-IL" w:eastAsia="en-IL"/>
+            <w:lang/>
           </w:rPr>
           <m:t>0</m:t>
         </m:r>
@@ -6782,7 +6449,7 @@
           <w:rFonts w:asciiTheme="minorHAnsi" w:eastAsia="Times New Roman" w:hAnsiTheme="minorHAnsi" w:cs="Times New Roman"/>
           <w:sz w:val="24"/>
           <w:szCs w:val="24"/>
-          <w:lang w:val="en-IL" w:eastAsia="en-IL"/>
+          <w:lang/>
         </w:rPr>
         <w:t xml:space="preserve"> and </w:t>
       </w:r>
@@ -6792,7 +6459,7 @@
             <w:rFonts w:ascii="Cambria Math" w:eastAsia="Times New Roman" w:hAnsi="Cambria Math" w:cs="Arial"/>
             <w:sz w:val="24"/>
             <w:szCs w:val="24"/>
-            <w:lang w:val="en-IL" w:eastAsia="en-IL"/>
+            <w:lang/>
           </w:rPr>
           <m:t>1</m:t>
         </m:r>
@@ -6802,7 +6469,7 @@
           <w:rFonts w:asciiTheme="minorHAnsi" w:eastAsia="Times New Roman" w:hAnsiTheme="minorHAnsi" w:cs="Times New Roman"/>
           <w:sz w:val="24"/>
           <w:szCs w:val="24"/>
-          <w:lang w:val="en-IL" w:eastAsia="en-IL"/>
+          <w:lang/>
         </w:rPr>
         <w:t xml:space="preserve"> indicating color distribution similarity. However, standard linear weights fail to cleanly separate the best-matching particles from mediocre background noise. By mapping the coefficient to an exponential scale (</w:t>
       </w:r>
@@ -6814,7 +6481,7 @@
                 <w:rFonts w:ascii="Cambria Math" w:eastAsia="Times New Roman" w:hAnsi="Cambria Math" w:cs="Arial"/>
                 <w:sz w:val="24"/>
                 <w:szCs w:val="24"/>
-                <w:lang w:val="en-IL" w:eastAsia="en-IL"/>
+                <w:lang/>
               </w:rPr>
             </m:ctrlPr>
           </m:funcPr>
@@ -6827,7 +6494,7 @@
                 <w:rFonts w:ascii="Cambria Math" w:eastAsia="Times New Roman" w:hAnsi="Cambria Math" w:cs="Arial"/>
                 <w:sz w:val="24"/>
                 <w:szCs w:val="24"/>
-                <w:lang w:val="en-IL" w:eastAsia="en-IL"/>
+                <w:lang/>
               </w:rPr>
               <m:t>exp</m:t>
             </m:r>
@@ -6840,7 +6507,7 @@
                     <w:rFonts w:ascii="Cambria Math" w:eastAsia="Times New Roman" w:hAnsi="Cambria Math" w:cs="Arial"/>
                     <w:sz w:val="24"/>
                     <w:szCs w:val="24"/>
-                    <w:lang w:val="en-IL" w:eastAsia="en-IL"/>
+                    <w:lang/>
                   </w:rPr>
                 </m:ctrlPr>
               </m:dPr>
@@ -6850,7 +6517,7 @@
                     <w:rFonts w:ascii="Cambria Math" w:eastAsia="Times New Roman" w:hAnsi="Cambria Math" w:cs="Arial"/>
                     <w:sz w:val="24"/>
                     <w:szCs w:val="24"/>
-                    <w:lang w:val="en-IL" w:eastAsia="en-IL"/>
+                    <w:lang/>
                   </w:rPr>
                   <m:t>20.0⋅ρ</m:t>
                 </m:r>
@@ -6864,19 +6531,19 @@
           <w:rFonts w:asciiTheme="minorHAnsi" w:eastAsia="Times New Roman" w:hAnsiTheme="minorHAnsi" w:cs="Times New Roman"/>
           <w:sz w:val="24"/>
           <w:szCs w:val="24"/>
-          <w:lang w:val="en-IL" w:eastAsia="en-IL"/>
+          <w:lang/>
         </w:rPr>
         <w:t>), we dramatically amplify the score variance. Particles that capture the exact color layout of the person receive massive, dominant importance weights, forcing the filter to rapidly converge on the true target.</w:t>
       </w:r>
     </w:p>
     <w:p>
       <w:pPr>
-        <w:pStyle w:val="ListParagraph"/>
+        <w:pStyle w:val="a8"/>
         <w:rPr>
           <w:rFonts w:ascii="Times New Roman" w:eastAsia="Times New Roman" w:hAnsi="Times New Roman" w:cs="Times New Roman"/>
           <w:sz w:val="24"/>
           <w:szCs w:val="24"/>
-          <w:lang w:val="en-IL" w:eastAsia="en-IL"/>
+          <w:lang/>
         </w:rPr>
       </w:pPr>
     </w:p>
@@ -10690,14 +10357,14 @@
     <w:lsdException w:name="Unresolved Mention" w:semiHidden="1" w:unhideWhenUsed="1"/>
     <w:lsdException w:name="Smart Link" w:semiHidden="1" w:unhideWhenUsed="1"/>
   </w:latentStyles>
-  <w:style w:type="paragraph" w:default="1" w:styleId="Normal">
+  <w:style w:type="paragraph" w:default="1" w:styleId="a">
     <w:name w:val="Normal"/>
     <w:qFormat/>
   </w:style>
-  <w:style w:type="paragraph" w:styleId="Heading1">
+  <w:style w:type="paragraph" w:styleId="10">
     <w:name w:val="heading 1"/>
-    <w:basedOn w:val="Normal"/>
-    <w:next w:val="Normal"/>
+    <w:basedOn w:val="a"/>
+    <w:next w:val="a"/>
     <w:uiPriority w:val="9"/>
     <w:qFormat/>
     <w:pPr>
@@ -10713,10 +10380,10 @@
       <w:szCs w:val="40"/>
     </w:rPr>
   </w:style>
-  <w:style w:type="paragraph" w:styleId="Heading2">
+  <w:style w:type="paragraph" w:styleId="2">
     <w:name w:val="heading 2"/>
-    <w:basedOn w:val="Normal"/>
-    <w:next w:val="Normal"/>
+    <w:basedOn w:val="a"/>
+    <w:next w:val="a"/>
     <w:uiPriority w:val="9"/>
     <w:semiHidden/>
     <w:unhideWhenUsed/>
@@ -10734,10 +10401,10 @@
       <w:szCs w:val="32"/>
     </w:rPr>
   </w:style>
-  <w:style w:type="paragraph" w:styleId="Heading3">
+  <w:style w:type="paragraph" w:styleId="3">
     <w:name w:val="heading 3"/>
-    <w:basedOn w:val="Normal"/>
-    <w:next w:val="Normal"/>
+    <w:basedOn w:val="a"/>
+    <w:next w:val="a"/>
     <w:uiPriority w:val="9"/>
     <w:semiHidden/>
     <w:unhideWhenUsed/>
@@ -10754,10 +10421,10 @@
       <w:szCs w:val="28"/>
     </w:rPr>
   </w:style>
-  <w:style w:type="paragraph" w:styleId="Heading4">
+  <w:style w:type="paragraph" w:styleId="4">
     <w:name w:val="heading 4"/>
-    <w:basedOn w:val="Normal"/>
-    <w:next w:val="Normal"/>
+    <w:basedOn w:val="a"/>
+    <w:next w:val="a"/>
     <w:uiPriority w:val="9"/>
     <w:semiHidden/>
     <w:unhideWhenUsed/>
@@ -10774,10 +10441,10 @@
       <w:color w:val="0F4761"/>
     </w:rPr>
   </w:style>
-  <w:style w:type="paragraph" w:styleId="Heading5">
+  <w:style w:type="paragraph" w:styleId="5">
     <w:name w:val="heading 5"/>
-    <w:basedOn w:val="Normal"/>
-    <w:next w:val="Normal"/>
+    <w:basedOn w:val="a"/>
+    <w:next w:val="a"/>
     <w:uiPriority w:val="9"/>
     <w:semiHidden/>
     <w:unhideWhenUsed/>
@@ -10792,10 +10459,10 @@
       <w:color w:val="0F4761"/>
     </w:rPr>
   </w:style>
-  <w:style w:type="paragraph" w:styleId="Heading6">
+  <w:style w:type="paragraph" w:styleId="6">
     <w:name w:val="heading 6"/>
-    <w:basedOn w:val="Normal"/>
-    <w:next w:val="Normal"/>
+    <w:basedOn w:val="a"/>
+    <w:next w:val="a"/>
     <w:uiPriority w:val="9"/>
     <w:semiHidden/>
     <w:unhideWhenUsed/>
@@ -10812,9 +10479,9 @@
       <w:color w:val="595959"/>
     </w:rPr>
   </w:style>
-  <w:style w:type="paragraph" w:styleId="Heading7">
+  <w:style w:type="paragraph" w:styleId="7">
     <w:name w:val="heading 7"/>
-    <w:link w:val="Heading7Char"/>
+    <w:link w:val="70"/>
     <w:uiPriority w:val="9"/>
     <w:semiHidden/>
     <w:unhideWhenUsed/>
@@ -10831,9 +10498,9 @@
       <w:color w:val="595959" w:themeColor="text1" w:themeTint="A6"/>
     </w:rPr>
   </w:style>
-  <w:style w:type="paragraph" w:styleId="Heading8">
+  <w:style w:type="paragraph" w:styleId="8">
     <w:name w:val="heading 8"/>
-    <w:link w:val="Heading8Char"/>
+    <w:link w:val="80"/>
     <w:uiPriority w:val="9"/>
     <w:semiHidden/>
     <w:unhideWhenUsed/>
@@ -10851,9 +10518,9 @@
       <w:color w:val="272727" w:themeColor="text1" w:themeTint="D8"/>
     </w:rPr>
   </w:style>
-  <w:style w:type="paragraph" w:styleId="Heading9">
+  <w:style w:type="paragraph" w:styleId="9">
     <w:name w:val="heading 9"/>
-    <w:link w:val="Heading9Char"/>
+    <w:link w:val="90"/>
     <w:uiPriority w:val="9"/>
     <w:semiHidden/>
     <w:unhideWhenUsed/>
@@ -10869,13 +10536,13 @@
       <w:color w:val="272727" w:themeColor="text1" w:themeTint="D8"/>
     </w:rPr>
   </w:style>
-  <w:style w:type="character" w:default="1" w:styleId="DefaultParagraphFont">
+  <w:style w:type="character" w:default="1" w:styleId="a0">
     <w:name w:val="Default Paragraph Font"/>
     <w:uiPriority w:val="1"/>
     <w:semiHidden/>
     <w:unhideWhenUsed/>
   </w:style>
-  <w:style w:type="table" w:default="1" w:styleId="TableNormal">
+  <w:style w:type="table" w:default="1" w:styleId="a1">
     <w:name w:val="Normal Table"/>
     <w:uiPriority w:val="99"/>
     <w:semiHidden/>
@@ -10890,11 +10557,37 @@
       </w:tblCellMar>
     </w:tblPr>
   </w:style>
-  <w:style w:type="numbering" w:default="1" w:styleId="NoList">
+  <w:style w:type="numbering" w:default="1" w:styleId="a2">
     <w:name w:val="No List"/>
     <w:uiPriority w:val="99"/>
     <w:semiHidden/>
     <w:unhideWhenUsed/>
+  </w:style>
+  <w:style w:type="table" w:customStyle="1" w:styleId="TableNormal">
+    <w:name w:val="TableNormal"/>
+    <w:tblPr>
+      <w:tblCellMar>
+        <w:top w:w="100" w:type="dxa"/>
+        <w:left w:w="100" w:type="dxa"/>
+        <w:bottom w:w="100" w:type="dxa"/>
+        <w:right w:w="100" w:type="dxa"/>
+      </w:tblCellMar>
+    </w:tblPr>
+  </w:style>
+  <w:style w:type="paragraph" w:styleId="a3">
+    <w:name w:val="Title"/>
+    <w:basedOn w:val="a"/>
+    <w:next w:val="a"/>
+    <w:uiPriority w:val="10"/>
+    <w:qFormat/>
+    <w:pPr>
+      <w:spacing w:after="80" w:line="240" w:lineRule="auto"/>
+    </w:pPr>
+    <w:rPr>
+      <w:rFonts w:ascii="Play" w:eastAsia="Play" w:hAnsi="Play" w:cs="Play"/>
+      <w:sz w:val="56"/>
+      <w:szCs w:val="56"/>
+    </w:rPr>
   </w:style>
   <w:style w:type="table" w:customStyle="1" w:styleId="TableNormal0">
     <w:name w:val="TableNormal"/>
@@ -10907,33 +10600,7 @@
       </w:tblCellMar>
     </w:tblPr>
   </w:style>
-  <w:style w:type="paragraph" w:styleId="Title">
-    <w:name w:val="Title"/>
-    <w:basedOn w:val="Normal"/>
-    <w:next w:val="Normal"/>
-    <w:uiPriority w:val="10"/>
-    <w:qFormat/>
-    <w:pPr>
-      <w:spacing w:after="80" w:line="240" w:lineRule="auto"/>
-    </w:pPr>
-    <w:rPr>
-      <w:rFonts w:ascii="Play" w:eastAsia="Play" w:hAnsi="Play" w:cs="Play"/>
-      <w:sz w:val="56"/>
-      <w:szCs w:val="56"/>
-    </w:rPr>
-  </w:style>
   <w:style w:type="table" w:customStyle="1" w:styleId="TableNormal1">
-    <w:name w:val="TableNormal"/>
-    <w:tblPr>
-      <w:tblCellMar>
-        <w:top w:w="100" w:type="dxa"/>
-        <w:left w:w="100" w:type="dxa"/>
-        <w:bottom w:w="100" w:type="dxa"/>
-        <w:right w:w="100" w:type="dxa"/>
-      </w:tblCellMar>
-    </w:tblPr>
-  </w:style>
-  <w:style w:type="table" w:customStyle="1" w:styleId="TableNormal2">
     <w:name w:val="TableNormal"/>
     <w:tblPr>
       <w:tblCellMar>
@@ -10963,7 +10630,7 @@
   </w:style>
   <w:style w:type="character" w:customStyle="1" w:styleId="SubHeading1Char">
     <w:name w:val="Sub Heading 1 Char"/>
-    <w:basedOn w:val="DefaultParagraphFont"/>
+    <w:basedOn w:val="a0"/>
     <w:link w:val="SubHeading1"/>
     <w:rsid w:val="00BC225B"/>
     <w:rPr>
@@ -11000,9 +10667,9 @@
       <w:lang w:val="en-US"/>
     </w:rPr>
   </w:style>
-  <w:style w:type="character" w:customStyle="1" w:styleId="10">
+  <w:style w:type="character" w:customStyle="1" w:styleId="11">
     <w:name w:val="כותרת 1 תו"/>
-    <w:basedOn w:val="DefaultParagraphFont"/>
+    <w:basedOn w:val="a0"/>
     <w:uiPriority w:val="9"/>
     <w:rsid w:val="00BC225B"/>
     <w:rPr>
@@ -11025,7 +10692,7 @@
   </w:style>
   <w:style w:type="character" w:customStyle="1" w:styleId="DefaultChar">
     <w:name w:val="Default Char"/>
-    <w:basedOn w:val="DefaultParagraphFont"/>
+    <w:basedOn w:val="a0"/>
     <w:link w:val="Default"/>
     <w:rsid w:val="00BC225B"/>
     <w:rPr>
@@ -11034,9 +10701,9 @@
       <w:sz w:val="24"/>
     </w:rPr>
   </w:style>
-  <w:style w:type="character" w:customStyle="1" w:styleId="2">
+  <w:style w:type="character" w:customStyle="1" w:styleId="20">
     <w:name w:val="כותרת 2 תו"/>
-    <w:basedOn w:val="DefaultParagraphFont"/>
+    <w:basedOn w:val="a0"/>
     <w:uiPriority w:val="9"/>
     <w:semiHidden/>
     <w:rsid w:val="009D5B39"/>
@@ -11047,9 +10714,9 @@
       <w:szCs w:val="32"/>
     </w:rPr>
   </w:style>
-  <w:style w:type="character" w:customStyle="1" w:styleId="3">
+  <w:style w:type="character" w:customStyle="1" w:styleId="30">
     <w:name w:val="כותרת 3 תו"/>
-    <w:basedOn w:val="DefaultParagraphFont"/>
+    <w:basedOn w:val="a0"/>
     <w:uiPriority w:val="9"/>
     <w:semiHidden/>
     <w:rsid w:val="009D5B39"/>
@@ -11060,9 +10727,9 @@
       <w:szCs w:val="28"/>
     </w:rPr>
   </w:style>
-  <w:style w:type="character" w:customStyle="1" w:styleId="4">
+  <w:style w:type="character" w:customStyle="1" w:styleId="40">
     <w:name w:val="כותרת 4 תו"/>
-    <w:basedOn w:val="DefaultParagraphFont"/>
+    <w:basedOn w:val="a0"/>
     <w:uiPriority w:val="9"/>
     <w:semiHidden/>
     <w:rsid w:val="009D5B39"/>
@@ -11073,9 +10740,9 @@
       <w:color w:val="0F4761" w:themeColor="accent1" w:themeShade="BF"/>
     </w:rPr>
   </w:style>
-  <w:style w:type="character" w:customStyle="1" w:styleId="5">
+  <w:style w:type="character" w:customStyle="1" w:styleId="50">
     <w:name w:val="כותרת 5 תו"/>
-    <w:basedOn w:val="DefaultParagraphFont"/>
+    <w:basedOn w:val="a0"/>
     <w:uiPriority w:val="9"/>
     <w:semiHidden/>
     <w:rsid w:val="009D5B39"/>
@@ -11084,9 +10751,9 @@
       <w:color w:val="0F4761" w:themeColor="accent1" w:themeShade="BF"/>
     </w:rPr>
   </w:style>
-  <w:style w:type="character" w:customStyle="1" w:styleId="6">
+  <w:style w:type="character" w:customStyle="1" w:styleId="60">
     <w:name w:val="כותרת 6 תו"/>
-    <w:basedOn w:val="DefaultParagraphFont"/>
+    <w:basedOn w:val="a0"/>
     <w:uiPriority w:val="9"/>
     <w:semiHidden/>
     <w:rsid w:val="009D5B39"/>
@@ -11097,10 +10764,10 @@
       <w:color w:val="595959" w:themeColor="text1" w:themeTint="A6"/>
     </w:rPr>
   </w:style>
-  <w:style w:type="character" w:customStyle="1" w:styleId="Heading7Char">
-    <w:name w:val="Heading 7 Char"/>
-    <w:basedOn w:val="DefaultParagraphFont"/>
-    <w:link w:val="Heading7"/>
+  <w:style w:type="character" w:customStyle="1" w:styleId="70">
+    <w:name w:val="כותרת 7 תו"/>
+    <w:basedOn w:val="a0"/>
+    <w:link w:val="7"/>
     <w:uiPriority w:val="9"/>
     <w:semiHidden/>
     <w:rsid w:val="009D5B39"/>
@@ -11109,10 +10776,10 @@
       <w:color w:val="595959" w:themeColor="text1" w:themeTint="A6"/>
     </w:rPr>
   </w:style>
-  <w:style w:type="character" w:customStyle="1" w:styleId="Heading8Char">
-    <w:name w:val="Heading 8 Char"/>
-    <w:basedOn w:val="DefaultParagraphFont"/>
-    <w:link w:val="Heading8"/>
+  <w:style w:type="character" w:customStyle="1" w:styleId="80">
+    <w:name w:val="כותרת 8 תו"/>
+    <w:basedOn w:val="a0"/>
+    <w:link w:val="8"/>
     <w:uiPriority w:val="9"/>
     <w:semiHidden/>
     <w:rsid w:val="009D5B39"/>
@@ -11123,10 +10790,10 @@
       <w:color w:val="272727" w:themeColor="text1" w:themeTint="D8"/>
     </w:rPr>
   </w:style>
-  <w:style w:type="character" w:customStyle="1" w:styleId="Heading9Char">
-    <w:name w:val="Heading 9 Char"/>
-    <w:basedOn w:val="DefaultParagraphFont"/>
-    <w:link w:val="Heading9"/>
+  <w:style w:type="character" w:customStyle="1" w:styleId="90">
+    <w:name w:val="כותרת 9 תו"/>
+    <w:basedOn w:val="a0"/>
+    <w:link w:val="9"/>
     <w:uiPriority w:val="9"/>
     <w:semiHidden/>
     <w:rsid w:val="009D5B39"/>
@@ -11135,9 +10802,9 @@
       <w:color w:val="272727" w:themeColor="text1" w:themeTint="D8"/>
     </w:rPr>
   </w:style>
-  <w:style w:type="character" w:customStyle="1" w:styleId="a">
+  <w:style w:type="character" w:customStyle="1" w:styleId="a4">
     <w:name w:val="כותרת טקסט תו"/>
-    <w:basedOn w:val="DefaultParagraphFont"/>
+    <w:basedOn w:val="a0"/>
     <w:uiPriority w:val="10"/>
     <w:rsid w:val="009D5B39"/>
     <w:rPr>
@@ -11148,9 +10815,9 @@
       <w:szCs w:val="56"/>
     </w:rPr>
   </w:style>
-  <w:style w:type="character" w:customStyle="1" w:styleId="a0">
+  <w:style w:type="character" w:customStyle="1" w:styleId="a5">
     <w:name w:val="כותרת משנה תו"/>
-    <w:basedOn w:val="DefaultParagraphFont"/>
+    <w:basedOn w:val="a0"/>
     <w:uiPriority w:val="11"/>
     <w:rsid w:val="009D5B39"/>
     <w:rPr>
@@ -11161,9 +10828,9 @@
       <w:szCs w:val="28"/>
     </w:rPr>
   </w:style>
-  <w:style w:type="paragraph" w:styleId="Quote">
+  <w:style w:type="paragraph" w:styleId="a6">
     <w:name w:val="Quote"/>
-    <w:link w:val="QuoteChar"/>
+    <w:link w:val="a7"/>
     <w:uiPriority w:val="29"/>
     <w:qFormat/>
     <w:rsid w:val="009D5B39"/>
@@ -11177,10 +10844,10 @@
       <w:color w:val="404040" w:themeColor="text1" w:themeTint="BF"/>
     </w:rPr>
   </w:style>
-  <w:style w:type="character" w:customStyle="1" w:styleId="QuoteChar">
-    <w:name w:val="Quote Char"/>
-    <w:basedOn w:val="DefaultParagraphFont"/>
-    <w:link w:val="Quote"/>
+  <w:style w:type="character" w:customStyle="1" w:styleId="a7">
+    <w:name w:val="ציטוט תו"/>
+    <w:basedOn w:val="a0"/>
+    <w:link w:val="a6"/>
     <w:uiPriority w:val="29"/>
     <w:rsid w:val="009D5B39"/>
     <w:rPr>
@@ -11189,7 +10856,7 @@
       <w:color w:val="404040" w:themeColor="text1" w:themeTint="BF"/>
     </w:rPr>
   </w:style>
-  <w:style w:type="paragraph" w:styleId="ListParagraph">
+  <w:style w:type="paragraph" w:styleId="a8">
     <w:name w:val="List Paragraph"/>
     <w:uiPriority w:val="34"/>
     <w:qFormat/>
@@ -11199,9 +10866,9 @@
       <w:contextualSpacing/>
     </w:pPr>
   </w:style>
-  <w:style w:type="character" w:styleId="IntenseEmphasis">
+  <w:style w:type="character" w:styleId="a9">
     <w:name w:val="Intense Emphasis"/>
-    <w:basedOn w:val="DefaultParagraphFont"/>
+    <w:basedOn w:val="a0"/>
     <w:uiPriority w:val="21"/>
     <w:qFormat/>
     <w:rsid w:val="009D5B39"/>
@@ -11211,9 +10878,9 @@
       <w:color w:val="0F4761" w:themeColor="accent1" w:themeShade="BF"/>
     </w:rPr>
   </w:style>
-  <w:style w:type="paragraph" w:styleId="IntenseQuote">
+  <w:style w:type="paragraph" w:styleId="aa">
     <w:name w:val="Intense Quote"/>
-    <w:link w:val="IntenseQuoteChar"/>
+    <w:link w:val="ab"/>
     <w:uiPriority w:val="30"/>
     <w:qFormat/>
     <w:rsid w:val="009D5B39"/>
@@ -11232,10 +10899,10 @@
       <w:color w:val="0F4761" w:themeColor="accent1" w:themeShade="BF"/>
     </w:rPr>
   </w:style>
-  <w:style w:type="character" w:customStyle="1" w:styleId="IntenseQuoteChar">
-    <w:name w:val="Intense Quote Char"/>
-    <w:basedOn w:val="DefaultParagraphFont"/>
-    <w:link w:val="IntenseQuote"/>
+  <w:style w:type="character" w:customStyle="1" w:styleId="ab">
+    <w:name w:val="ציטוט חזק תו"/>
+    <w:basedOn w:val="a0"/>
+    <w:link w:val="aa"/>
     <w:uiPriority w:val="30"/>
     <w:rsid w:val="009D5B39"/>
     <w:rPr>
@@ -11244,9 +10911,9 @@
       <w:color w:val="0F4761" w:themeColor="accent1" w:themeShade="BF"/>
     </w:rPr>
   </w:style>
-  <w:style w:type="character" w:styleId="IntenseReference">
+  <w:style w:type="character" w:styleId="ac">
     <w:name w:val="Intense Reference"/>
-    <w:basedOn w:val="DefaultParagraphFont"/>
+    <w:basedOn w:val="a0"/>
     <w:uiPriority w:val="32"/>
     <w:qFormat/>
     <w:rsid w:val="009D5B39"/>
@@ -11258,9 +10925,9 @@
       <w:spacing w:val="5"/>
     </w:rPr>
   </w:style>
-  <w:style w:type="character" w:styleId="PlaceholderText">
+  <w:style w:type="character" w:styleId="ad">
     <w:name w:val="Placeholder Text"/>
-    <w:basedOn w:val="DefaultParagraphFont"/>
+    <w:basedOn w:val="a0"/>
     <w:uiPriority w:val="99"/>
     <w:semiHidden/>
     <w:rsid w:val="00EB24A6"/>
@@ -11270,7 +10937,7 @@
   </w:style>
   <w:style w:type="character" w:styleId="Hyperlink">
     <w:name w:val="Hyperlink"/>
-    <w:basedOn w:val="DefaultParagraphFont"/>
+    <w:basedOn w:val="a0"/>
     <w:uiPriority w:val="99"/>
     <w:unhideWhenUsed/>
     <w:rsid w:val="0037569B"/>
@@ -11279,9 +10946,9 @@
       <w:u w:val="single"/>
     </w:rPr>
   </w:style>
-  <w:style w:type="character" w:styleId="UnresolvedMention">
+  <w:style w:type="character" w:styleId="ae">
     <w:name w:val="Unresolved Mention"/>
-    <w:basedOn w:val="DefaultParagraphFont"/>
+    <w:basedOn w:val="a0"/>
     <w:uiPriority w:val="99"/>
     <w:semiHidden/>
     <w:unhideWhenUsed/>
@@ -11302,10 +10969,10 @@
       <w:szCs w:val="24"/>
     </w:rPr>
   </w:style>
-  <w:style w:type="paragraph" w:styleId="Subtitle">
+  <w:style w:type="paragraph" w:styleId="af">
     <w:name w:val="Subtitle"/>
-    <w:basedOn w:val="Normal"/>
-    <w:next w:val="Normal"/>
+    <w:basedOn w:val="a"/>
+    <w:next w:val="a"/>
     <w:uiPriority w:val="11"/>
     <w:qFormat/>
     <w:pPr>
@@ -11317,10 +10984,10 @@
       <w:szCs w:val="28"/>
     </w:rPr>
   </w:style>
-  <w:style w:type="paragraph" w:styleId="HTMLPreformatted">
+  <w:style w:type="paragraph" w:styleId="HTML">
     <w:name w:val="HTML Preformatted"/>
-    <w:basedOn w:val="Normal"/>
-    <w:link w:val="HTMLPreformattedChar"/>
+    <w:basedOn w:val="a"/>
+    <w:link w:val="HTML0"/>
     <w:uiPriority w:val="99"/>
     <w:semiHidden/>
     <w:unhideWhenUsed/>
@@ -11334,10 +11001,10 @@
       <w:szCs w:val="20"/>
     </w:rPr>
   </w:style>
-  <w:style w:type="character" w:customStyle="1" w:styleId="HTMLPreformattedChar">
-    <w:name w:val="HTML Preformatted Char"/>
-    <w:basedOn w:val="DefaultParagraphFont"/>
-    <w:link w:val="HTMLPreformatted"/>
+  <w:style w:type="character" w:customStyle="1" w:styleId="HTML0">
+    <w:name w:val="HTML מעוצב מראש תו"/>
+    <w:basedOn w:val="a0"/>
+    <w:link w:val="HTML"/>
     <w:uiPriority w:val="99"/>
     <w:semiHidden/>
     <w:rsid w:val="000A6A91"/>
@@ -11359,7 +11026,7 @@
   </w:style>
   <w:style w:type="character" w:styleId="HTMLCode">
     <w:name w:val="HTML Code"/>
-    <w:basedOn w:val="DefaultParagraphFont"/>
+    <w:basedOn w:val="a0"/>
     <w:uiPriority w:val="99"/>
     <w:semiHidden/>
     <w:unhideWhenUsed/>
@@ -11370,10 +11037,10 @@
       <w:szCs w:val="20"/>
     </w:rPr>
   </w:style>
-  <w:style w:type="paragraph" w:styleId="Header">
+  <w:style w:type="paragraph" w:styleId="af0">
     <w:name w:val="header"/>
-    <w:basedOn w:val="Normal"/>
-    <w:link w:val="HeaderChar"/>
+    <w:basedOn w:val="a"/>
+    <w:link w:val="af1"/>
     <w:uiPriority w:val="99"/>
     <w:unhideWhenUsed/>
     <w:rsid w:val="009048FB"/>
@@ -11385,17 +11052,17 @@
       <w:spacing w:line="240" w:lineRule="auto"/>
     </w:pPr>
   </w:style>
-  <w:style w:type="character" w:customStyle="1" w:styleId="HeaderChar">
-    <w:name w:val="Header Char"/>
-    <w:basedOn w:val="DefaultParagraphFont"/>
-    <w:link w:val="Header"/>
+  <w:style w:type="character" w:customStyle="1" w:styleId="af1">
+    <w:name w:val="כותרת עליונה תו"/>
+    <w:basedOn w:val="a0"/>
+    <w:link w:val="af0"/>
     <w:uiPriority w:val="99"/>
     <w:rsid w:val="009048FB"/>
   </w:style>
-  <w:style w:type="paragraph" w:styleId="Footer">
+  <w:style w:type="paragraph" w:styleId="af2">
     <w:name w:val="footer"/>
-    <w:basedOn w:val="Normal"/>
-    <w:link w:val="FooterChar"/>
+    <w:basedOn w:val="a"/>
+    <w:link w:val="af3"/>
     <w:uiPriority w:val="99"/>
     <w:unhideWhenUsed/>
     <w:rsid w:val="009048FB"/>
@@ -11407,10 +11074,10 @@
       <w:spacing w:line="240" w:lineRule="auto"/>
     </w:pPr>
   </w:style>
-  <w:style w:type="character" w:customStyle="1" w:styleId="FooterChar">
-    <w:name w:val="Footer Char"/>
-    <w:basedOn w:val="DefaultParagraphFont"/>
-    <w:link w:val="Footer"/>
+  <w:style w:type="character" w:customStyle="1" w:styleId="af3">
+    <w:name w:val="כותרת תחתונה תו"/>
+    <w:basedOn w:val="a0"/>
+    <w:link w:val="af2"/>
     <w:uiPriority w:val="99"/>
     <w:rsid w:val="009048FB"/>
   </w:style>
@@ -11713,28 +11380,28 @@
 </file>
 
 <file path=customXml/item1.xml><?xml version="1.0" encoding="utf-8"?>
+<b:Sources xmlns:b="http://schemas.openxmlformats.org/officeDocument/2006/bibliography" xmlns="http://schemas.openxmlformats.org/officeDocument/2006/bibliography" SelectedStyle="\APASixthEditionOfficeOnline.xsl" StyleName="APA" Version="6"/>
+</file>
+
+<file path=customXml/item2.xml><?xml version="1.0" encoding="utf-8"?>
 <go:gDocsCustomXmlDataStorage xmlns:go="http://customooxmlschemas.google.com/" xmlns:r="http://schemas.openxmlformats.org/officeDocument/2006/relationships" uri="GoogleDocsCustomDataVersion2">
   <go:docsCustomData xmlns:go="http://customooxmlschemas.google.com/" roundtripDataSignature="AMtx7missuwc7uN/iV/wvVCOARmLVuLQVQ==">CgMxLjA4AHIhMTVRU0h0a1QxLXViMHJYb1dqUGJJWUJtSTZLQk81Y2Fl</go:docsCustomData>
 </go:gDocsCustomXmlDataStorage>
 </file>
 
-<file path=customXml/item2.xml><?xml version="1.0" encoding="utf-8"?>
-<b:Sources xmlns:b="http://schemas.openxmlformats.org/officeDocument/2006/bibliography" xmlns="http://schemas.openxmlformats.org/officeDocument/2006/bibliography" SelectedStyle="\APASixthEditionOfficeOnline.xsl" StyleName="APA" Version="6"/>
+<file path=customXml/itemProps1.xml><?xml version="1.0" encoding="utf-8"?>
+<ds:datastoreItem xmlns:ds="http://schemas.openxmlformats.org/officeDocument/2006/customXml" ds:itemID="{DA0BD7F8-36DA-4C63-AFAC-8270B05BF53A}">
+  <ds:schemaRefs>
+    <ds:schemaRef ds:uri="http://schemas.openxmlformats.org/officeDocument/2006/bibliography"/>
+  </ds:schemaRefs>
+</ds:datastoreItem>
 </file>
 
-<file path=customXml/itemProps1.xml><?xml version="1.0" encoding="utf-8"?>
+<file path=customXml/itemProps2.xml><?xml version="1.0" encoding="utf-8"?>
 <ds:datastoreItem xmlns:ds="http://schemas.openxmlformats.org/officeDocument/2006/customXml" ds:itemID="{11111111-1234-1234-1234-123412341234}">
   <ds:schemaRefs>
     <ds:schemaRef ds:uri="http://customooxmlschemas.google.com/"/>
     <ds:schemaRef ds:uri="http://schemas.openxmlformats.org/officeDocument/2006/relationships"/>
   </ds:schemaRefs>
 </ds:datastoreItem>
-</file>
-
-<file path=customXml/itemProps2.xml><?xml version="1.0" encoding="utf-8"?>
-<ds:datastoreItem xmlns:ds="http://schemas.openxmlformats.org/officeDocument/2006/customXml" ds:itemID="{DA0BD7F8-36DA-4C63-AFAC-8270B05BF53A}">
-  <ds:schemaRefs>
-    <ds:schemaRef ds:uri="http://schemas.openxmlformats.org/officeDocument/2006/bibliography"/>
-  </ds:schemaRefs>
-</ds:datastoreItem>
 </file>
</xml_diff>